<commit_message>
modified:   .gitignore 	deleted:    .~lock.Resume-LoganMancuso-DevOpsEng.docx# 	modified:   Resume-LoganMancuso-DevOpsEng.docx 	deleted:    _config.yml.bak 	modified:   _data/experience.yml 	modified:   _data/projects.yml 	modified:   _data/skills.yml
publishing changes
</commit_message>
<xml_diff>
--- a/Resume-LoganMancuso-DevOpsEng.docx
+++ b/Resume-LoganMancuso-DevOpsEng.docx
@@ -624,55 +624,7 @@
           <w:sz w:val="22"/>
           <w:szCs w:val="22"/>
         </w:rPr>
-        <w:t xml:space="preserve">Team </w:t>
-      </w:r>
-      <w:r>
-        <w:rPr>
-          <w:rFonts w:cs="Arial" w:ascii="Calibri" w:hAnsi="Calibri" w:asciiTheme="minorHAnsi" w:hAnsiTheme="minorHAnsi"/>
-          <w:sz w:val="22"/>
-          <w:szCs w:val="22"/>
-        </w:rPr>
-        <w:t>b</w:t>
-      </w:r>
-      <w:r>
-        <w:rPr>
-          <w:rFonts w:cs="Arial" w:ascii="Calibri" w:hAnsi="Calibri" w:asciiTheme="minorHAnsi" w:hAnsiTheme="minorHAnsi"/>
-          <w:sz w:val="22"/>
-          <w:szCs w:val="22"/>
-        </w:rPr>
-        <w:t xml:space="preserve">uilding, </w:t>
-      </w:r>
-      <w:r>
-        <w:rPr>
-          <w:rFonts w:cs="Arial" w:ascii="Calibri" w:hAnsi="Calibri" w:asciiTheme="minorHAnsi" w:hAnsiTheme="minorHAnsi"/>
-          <w:sz w:val="22"/>
-          <w:szCs w:val="22"/>
-        </w:rPr>
-        <w:t>t</w:t>
-      </w:r>
-      <w:r>
-        <w:rPr>
-          <w:rFonts w:cs="Arial" w:ascii="Calibri" w:hAnsi="Calibri" w:asciiTheme="minorHAnsi" w:hAnsiTheme="minorHAnsi"/>
-          <w:sz w:val="22"/>
-          <w:szCs w:val="22"/>
-        </w:rPr>
-        <w:t xml:space="preserve">echnical </w:t>
-      </w:r>
-      <w:r>
-        <w:rPr>
-          <w:rFonts w:cs="Arial" w:ascii="Calibri" w:hAnsi="Calibri" w:asciiTheme="minorHAnsi" w:hAnsiTheme="minorHAnsi"/>
-          <w:sz w:val="22"/>
-          <w:szCs w:val="22"/>
-        </w:rPr>
-        <w:t>a</w:t>
-      </w:r>
-      <w:r>
-        <w:rPr>
-          <w:rFonts w:cs="Arial" w:ascii="Calibri" w:hAnsi="Calibri" w:asciiTheme="minorHAnsi" w:hAnsiTheme="minorHAnsi"/>
-          <w:sz w:val="22"/>
-          <w:szCs w:val="22"/>
-        </w:rPr>
-        <w:t>rchitect, live troubleshooting, and client communication skills.</w:t>
+        <w:t>Team building, technical architect, live troubleshooting, and client communication skills.</w:t>
       </w:r>
     </w:p>
     <w:p>
@@ -728,7 +680,7 @@
           <w:sz w:val="22"/>
           <w:szCs w:val="22"/>
         </w:rPr>
-        <w:t>Dot Net 3.5, 4.6 and 6, Python, Java, JavaScript, C++, C</w:t>
+        <w:t>Dot Net 3.5, 4.6 and 6, Python, Java, JavaScript, C++,  C</w:t>
       </w:r>
     </w:p>
     <w:p>
@@ -760,7 +712,15 @@
           <w:sz w:val="22"/>
           <w:szCs w:val="22"/>
         </w:rPr>
-        <w:t xml:space="preserve"> Microsoft SQL, MySQL\MariaDB\PostgreSQL</w:t>
+        <w:t xml:space="preserve"> Microsoft SQL, MySQL, MariaDB, Postgre</w:t>
+      </w:r>
+      <w:r>
+        <w:rPr>
+          <w:rFonts w:ascii="Calibri" w:hAnsi="Calibri" w:asciiTheme="minorHAnsi" w:hAnsiTheme="minorHAnsi"/>
+          <w:sz w:val="22"/>
+          <w:szCs w:val="22"/>
+        </w:rPr>
+        <w:t>s</w:t>
       </w:r>
     </w:p>
     <w:p>
@@ -1173,8 +1133,8 @@
       </w:tblPr>
       <w:tblGrid>
         <w:gridCol w:w="445"/>
-        <w:gridCol w:w="1977"/>
-        <w:gridCol w:w="7648"/>
+        <w:gridCol w:w="1976"/>
+        <w:gridCol w:w="7649"/>
       </w:tblGrid>
       <w:tr>
         <w:trPr/>
@@ -1232,7 +1192,7 @@
         </w:tc>
         <w:tc>
           <w:tcPr>
-            <w:tcW w:w="1977" w:type="dxa"/>
+            <w:tcW w:w="1976" w:type="dxa"/>
             <w:tcBorders>
               <w:top w:val="nil"/>
               <w:left w:val="nil"/>
@@ -1287,7 +1247,7 @@
         </w:tc>
         <w:tc>
           <w:tcPr>
-            <w:tcW w:w="7648" w:type="dxa"/>
+            <w:tcW w:w="7649" w:type="dxa"/>
             <w:tcBorders>
               <w:top w:val="nil"/>
               <w:left w:val="nil"/>
@@ -1362,7 +1322,7 @@
         </w:tc>
         <w:tc>
           <w:tcPr>
-            <w:tcW w:w="1977" w:type="dxa"/>
+            <w:tcW w:w="1976" w:type="dxa"/>
             <w:tcBorders>
               <w:top w:val="nil"/>
               <w:left w:val="nil"/>
@@ -1404,7 +1364,7 @@
         </w:tc>
         <w:tc>
           <w:tcPr>
-            <w:tcW w:w="7648" w:type="dxa"/>
+            <w:tcW w:w="7649" w:type="dxa"/>
             <w:tcBorders>
               <w:top w:val="nil"/>
               <w:left w:val="nil"/>
@@ -1484,7 +1444,7 @@
         </w:tc>
         <w:tc>
           <w:tcPr>
-            <w:tcW w:w="1977" w:type="dxa"/>
+            <w:tcW w:w="1976" w:type="dxa"/>
             <w:tcBorders>
               <w:top w:val="nil"/>
               <w:left w:val="nil"/>
@@ -1526,7 +1486,7 @@
         </w:tc>
         <w:tc>
           <w:tcPr>
-            <w:tcW w:w="7648" w:type="dxa"/>
+            <w:tcW w:w="7649" w:type="dxa"/>
             <w:tcBorders>
               <w:top w:val="nil"/>
               <w:left w:val="nil"/>
@@ -1635,7 +1595,7 @@
         </w:tc>
         <w:tc>
           <w:tcPr>
-            <w:tcW w:w="1977" w:type="dxa"/>
+            <w:tcW w:w="1976" w:type="dxa"/>
             <w:tcBorders>
               <w:top w:val="nil"/>
               <w:left w:val="nil"/>
@@ -1677,7 +1637,7 @@
         </w:tc>
         <w:tc>
           <w:tcPr>
-            <w:tcW w:w="7648" w:type="dxa"/>
+            <w:tcW w:w="7649" w:type="dxa"/>
             <w:tcBorders>
               <w:top w:val="nil"/>
               <w:left w:val="nil"/>
@@ -1757,7 +1717,7 @@
         </w:tc>
         <w:tc>
           <w:tcPr>
-            <w:tcW w:w="1977" w:type="dxa"/>
+            <w:tcW w:w="1976" w:type="dxa"/>
             <w:tcBorders>
               <w:top w:val="nil"/>
               <w:left w:val="nil"/>
@@ -1804,7 +1764,7 @@
         </w:tc>
         <w:tc>
           <w:tcPr>
-            <w:tcW w:w="7648" w:type="dxa"/>
+            <w:tcW w:w="7649" w:type="dxa"/>
             <w:tcBorders>
               <w:top w:val="nil"/>
               <w:left w:val="nil"/>
@@ -1990,7 +1950,7 @@
         </w:tc>
         <w:tc>
           <w:tcPr>
-            <w:tcW w:w="1977" w:type="dxa"/>
+            <w:tcW w:w="1976" w:type="dxa"/>
             <w:tcBorders>
               <w:top w:val="nil"/>
               <w:left w:val="nil"/>
@@ -2032,7 +1992,7 @@
         </w:tc>
         <w:tc>
           <w:tcPr>
-            <w:tcW w:w="7648" w:type="dxa"/>
+            <w:tcW w:w="7649" w:type="dxa"/>
             <w:tcBorders>
               <w:top w:val="nil"/>
               <w:left w:val="nil"/>
@@ -2112,7 +2072,7 @@
         </w:tc>
         <w:tc>
           <w:tcPr>
-            <w:tcW w:w="1977" w:type="dxa"/>
+            <w:tcW w:w="1976" w:type="dxa"/>
             <w:tcBorders>
               <w:top w:val="nil"/>
               <w:left w:val="nil"/>
@@ -2155,7 +2115,7 @@
         </w:tc>
         <w:tc>
           <w:tcPr>
-            <w:tcW w:w="7648" w:type="dxa"/>
+            <w:tcW w:w="7649" w:type="dxa"/>
             <w:tcBorders>
               <w:top w:val="nil"/>
               <w:left w:val="nil"/>
@@ -2235,7 +2195,7 @@
         </w:tc>
         <w:tc>
           <w:tcPr>
-            <w:tcW w:w="1977" w:type="dxa"/>
+            <w:tcW w:w="1976" w:type="dxa"/>
             <w:tcBorders>
               <w:top w:val="nil"/>
               <w:left w:val="nil"/>
@@ -2278,7 +2238,7 @@
         </w:tc>
         <w:tc>
           <w:tcPr>
-            <w:tcW w:w="7648" w:type="dxa"/>
+            <w:tcW w:w="7649" w:type="dxa"/>
             <w:tcBorders>
               <w:top w:val="nil"/>
               <w:left w:val="nil"/>
@@ -2509,8 +2469,8 @@
       </w:tblPr>
       <w:tblGrid>
         <w:gridCol w:w="445"/>
-        <w:gridCol w:w="1977"/>
-        <w:gridCol w:w="7648"/>
+        <w:gridCol w:w="1976"/>
+        <w:gridCol w:w="7649"/>
       </w:tblGrid>
       <w:tr>
         <w:trPr/>
@@ -2568,7 +2528,7 @@
         </w:tc>
         <w:tc>
           <w:tcPr>
-            <w:tcW w:w="1977" w:type="dxa"/>
+            <w:tcW w:w="1976" w:type="dxa"/>
             <w:tcBorders>
               <w:top w:val="nil"/>
               <w:left w:val="nil"/>
@@ -2623,7 +2583,7 @@
         </w:tc>
         <w:tc>
           <w:tcPr>
-            <w:tcW w:w="7648" w:type="dxa"/>
+            <w:tcW w:w="7649" w:type="dxa"/>
             <w:tcBorders>
               <w:top w:val="nil"/>
               <w:left w:val="nil"/>
@@ -2698,7 +2658,7 @@
         </w:tc>
         <w:tc>
           <w:tcPr>
-            <w:tcW w:w="1977" w:type="dxa"/>
+            <w:tcW w:w="1976" w:type="dxa"/>
             <w:tcBorders>
               <w:top w:val="nil"/>
               <w:left w:val="nil"/>
@@ -2740,7 +2700,7 @@
         </w:tc>
         <w:tc>
           <w:tcPr>
-            <w:tcW w:w="7648" w:type="dxa"/>
+            <w:tcW w:w="7649" w:type="dxa"/>
             <w:tcBorders>
               <w:top w:val="nil"/>
               <w:left w:val="nil"/>
@@ -2820,7 +2780,7 @@
         </w:tc>
         <w:tc>
           <w:tcPr>
-            <w:tcW w:w="1977" w:type="dxa"/>
+            <w:tcW w:w="1976" w:type="dxa"/>
             <w:tcBorders>
               <w:top w:val="nil"/>
               <w:left w:val="nil"/>
@@ -2862,7 +2822,7 @@
         </w:tc>
         <w:tc>
           <w:tcPr>
-            <w:tcW w:w="7648" w:type="dxa"/>
+            <w:tcW w:w="7649" w:type="dxa"/>
             <w:tcBorders>
               <w:top w:val="nil"/>
               <w:left w:val="nil"/>
@@ -2942,7 +2902,7 @@
         </w:tc>
         <w:tc>
           <w:tcPr>
-            <w:tcW w:w="1977" w:type="dxa"/>
+            <w:tcW w:w="1976" w:type="dxa"/>
             <w:tcBorders>
               <w:top w:val="nil"/>
               <w:left w:val="nil"/>
@@ -2984,7 +2944,7 @@
         </w:tc>
         <w:tc>
           <w:tcPr>
-            <w:tcW w:w="7648" w:type="dxa"/>
+            <w:tcW w:w="7649" w:type="dxa"/>
             <w:tcBorders>
               <w:top w:val="nil"/>
               <w:left w:val="nil"/>
@@ -3064,7 +3024,7 @@
         </w:tc>
         <w:tc>
           <w:tcPr>
-            <w:tcW w:w="1977" w:type="dxa"/>
+            <w:tcW w:w="1976" w:type="dxa"/>
             <w:tcBorders>
               <w:top w:val="nil"/>
               <w:left w:val="nil"/>
@@ -3111,7 +3071,7 @@
         </w:tc>
         <w:tc>
           <w:tcPr>
-            <w:tcW w:w="7648" w:type="dxa"/>
+            <w:tcW w:w="7649" w:type="dxa"/>
             <w:tcBorders>
               <w:top w:val="nil"/>
               <w:left w:val="nil"/>
@@ -3216,7 +3176,7 @@
         </w:tc>
         <w:tc>
           <w:tcPr>
-            <w:tcW w:w="1977" w:type="dxa"/>
+            <w:tcW w:w="1976" w:type="dxa"/>
             <w:tcBorders>
               <w:top w:val="nil"/>
               <w:left w:val="nil"/>
@@ -3258,7 +3218,7 @@
         </w:tc>
         <w:tc>
           <w:tcPr>
-            <w:tcW w:w="7648" w:type="dxa"/>
+            <w:tcW w:w="7649" w:type="dxa"/>
             <w:tcBorders>
               <w:top w:val="nil"/>
               <w:left w:val="nil"/>
@@ -3338,7 +3298,7 @@
         </w:tc>
         <w:tc>
           <w:tcPr>
-            <w:tcW w:w="1977" w:type="dxa"/>
+            <w:tcW w:w="1976" w:type="dxa"/>
             <w:tcBorders>
               <w:top w:val="nil"/>
               <w:left w:val="nil"/>
@@ -3381,7 +3341,7 @@
         </w:tc>
         <w:tc>
           <w:tcPr>
-            <w:tcW w:w="7648" w:type="dxa"/>
+            <w:tcW w:w="7649" w:type="dxa"/>
             <w:tcBorders>
               <w:top w:val="nil"/>
               <w:left w:val="nil"/>
@@ -3461,7 +3421,7 @@
         </w:tc>
         <w:tc>
           <w:tcPr>
-            <w:tcW w:w="1977" w:type="dxa"/>
+            <w:tcW w:w="1976" w:type="dxa"/>
             <w:tcBorders>
               <w:top w:val="nil"/>
               <w:left w:val="nil"/>
@@ -3504,7 +3464,7 @@
         </w:tc>
         <w:tc>
           <w:tcPr>
-            <w:tcW w:w="7648" w:type="dxa"/>
+            <w:tcW w:w="7649" w:type="dxa"/>
             <w:tcBorders>
               <w:top w:val="nil"/>
               <w:left w:val="nil"/>
@@ -3665,8 +3625,8 @@
       </w:tblPr>
       <w:tblGrid>
         <w:gridCol w:w="445"/>
-        <w:gridCol w:w="1977"/>
-        <w:gridCol w:w="7648"/>
+        <w:gridCol w:w="1976"/>
+        <w:gridCol w:w="7649"/>
       </w:tblGrid>
       <w:tr>
         <w:trPr/>
@@ -3710,7 +3670,7 @@
         </w:tc>
         <w:tc>
           <w:tcPr>
-            <w:tcW w:w="1977" w:type="dxa"/>
+            <w:tcW w:w="1976" w:type="dxa"/>
             <w:tcBorders>
               <w:top w:val="nil"/>
               <w:left w:val="nil"/>
@@ -3752,7 +3712,7 @@
         </w:tc>
         <w:tc>
           <w:tcPr>
-            <w:tcW w:w="7648" w:type="dxa"/>
+            <w:tcW w:w="7649" w:type="dxa"/>
             <w:tcBorders>
               <w:top w:val="nil"/>
               <w:left w:val="nil"/>
@@ -3834,7 +3794,7 @@
         </w:tc>
         <w:tc>
           <w:tcPr>
-            <w:tcW w:w="1977" w:type="dxa"/>
+            <w:tcW w:w="1976" w:type="dxa"/>
             <w:tcBorders>
               <w:top w:val="nil"/>
               <w:left w:val="nil"/>
@@ -3876,7 +3836,7 @@
         </w:tc>
         <w:tc>
           <w:tcPr>
-            <w:tcW w:w="7648" w:type="dxa"/>
+            <w:tcW w:w="7649" w:type="dxa"/>
             <w:tcBorders>
               <w:top w:val="nil"/>
               <w:left w:val="nil"/>
@@ -3958,7 +3918,7 @@
         </w:tc>
         <w:tc>
           <w:tcPr>
-            <w:tcW w:w="1977" w:type="dxa"/>
+            <w:tcW w:w="1976" w:type="dxa"/>
             <w:tcBorders>
               <w:top w:val="nil"/>
               <w:left w:val="nil"/>
@@ -4000,7 +3960,7 @@
         </w:tc>
         <w:tc>
           <w:tcPr>
-            <w:tcW w:w="7648" w:type="dxa"/>
+            <w:tcW w:w="7649" w:type="dxa"/>
             <w:tcBorders>
               <w:top w:val="nil"/>
               <w:left w:val="nil"/>
@@ -4082,7 +4042,7 @@
         </w:tc>
         <w:tc>
           <w:tcPr>
-            <w:tcW w:w="1977" w:type="dxa"/>
+            <w:tcW w:w="1976" w:type="dxa"/>
             <w:tcBorders>
               <w:top w:val="nil"/>
               <w:left w:val="nil"/>
@@ -4130,7 +4090,7 @@
         </w:tc>
         <w:tc>
           <w:tcPr>
-            <w:tcW w:w="7648" w:type="dxa"/>
+            <w:tcW w:w="7649" w:type="dxa"/>
             <w:tcBorders>
               <w:top w:val="nil"/>
               <w:left w:val="nil"/>
@@ -4430,7 +4390,7 @@
         </w:tc>
         <w:tc>
           <w:tcPr>
-            <w:tcW w:w="1977" w:type="dxa"/>
+            <w:tcW w:w="1976" w:type="dxa"/>
             <w:tcBorders>
               <w:top w:val="nil"/>
               <w:left w:val="nil"/>
@@ -4472,7 +4432,7 @@
         </w:tc>
         <w:tc>
           <w:tcPr>
-            <w:tcW w:w="7648" w:type="dxa"/>
+            <w:tcW w:w="7649" w:type="dxa"/>
             <w:tcBorders>
               <w:top w:val="nil"/>
               <w:left w:val="nil"/>
@@ -4554,7 +4514,7 @@
         </w:tc>
         <w:tc>
           <w:tcPr>
-            <w:tcW w:w="1977" w:type="dxa"/>
+            <w:tcW w:w="1976" w:type="dxa"/>
             <w:tcBorders>
               <w:top w:val="nil"/>
               <w:left w:val="nil"/>
@@ -4598,7 +4558,7 @@
         </w:tc>
         <w:tc>
           <w:tcPr>
-            <w:tcW w:w="7648" w:type="dxa"/>
+            <w:tcW w:w="7649" w:type="dxa"/>
             <w:tcBorders>
               <w:top w:val="nil"/>
               <w:left w:val="nil"/>
@@ -4680,7 +4640,7 @@
         </w:tc>
         <w:tc>
           <w:tcPr>
-            <w:tcW w:w="1977" w:type="dxa"/>
+            <w:tcW w:w="1976" w:type="dxa"/>
             <w:tcBorders>
               <w:top w:val="nil"/>
               <w:left w:val="nil"/>
@@ -4724,7 +4684,7 @@
         </w:tc>
         <w:tc>
           <w:tcPr>
-            <w:tcW w:w="7648" w:type="dxa"/>
+            <w:tcW w:w="7649" w:type="dxa"/>
             <w:tcBorders>
               <w:top w:val="nil"/>
               <w:left w:val="nil"/>

</xml_diff>

<commit_message>
update resume	modified:   Resume-LoganMancuso-DevOpsEng.docx
</commit_message>
<xml_diff>
--- a/Resume-LoganMancuso-DevOpsEng.docx
+++ b/Resume-LoganMancuso-DevOpsEng.docx
@@ -5,6 +5,10 @@
     <w:p>
       <w:pPr>
         <w:pStyle w:val="Normal"/>
+        <w:tabs>
+          <w:tab w:val="clear" w:pos="720"/>
+          <w:tab w:val="left" w:pos="7560" w:leader="none"/>
+        </w:tabs>
         <w:rPr>
           <w:rFonts w:ascii="Calibri" w:hAnsi="Calibri" w:cs="Calibri"/>
           <w:bCs/>
@@ -20,7 +24,6 @@
           <w:szCs w:val="36"/>
         </w:rPr>
         <w:t>Logan Mancuso</w:t>
-        <w:tab/>
         <w:tab/>
       </w:r>
       <w:hyperlink r:id="rId2">
@@ -312,12 +315,22 @@
             </w:hyperlink>
             <w:r>
               <w:rPr>
+                <w:rStyle w:val="InternetLink"/>
                 <w:rFonts w:eastAsia="Times New Roman" w:cs="Times New Roman" w:ascii="Calibri" w:hAnsi="Calibri"/>
                 <w:kern w:val="0"/>
                 <w:szCs w:val="22"/>
                 <w:lang w:val="en-US" w:eastAsia="en-US" w:bidi="ar-SA"/>
               </w:rPr>
-              <w:t xml:space="preserve">  (803) 470-3985</w:t>
+              <w:t xml:space="preserve">                                                 </w:t>
+            </w:r>
+            <w:r>
+              <w:rPr>
+                <w:rFonts w:eastAsia="Times New Roman" w:cs="Times New Roman" w:ascii="Calibri" w:hAnsi="Calibri"/>
+                <w:kern w:val="0"/>
+                <w:szCs w:val="22"/>
+                <w:lang w:val="en-US" w:eastAsia="en-US" w:bidi="ar-SA"/>
+              </w:rPr>
+              <w:t>(803) 470-3985</w:t>
             </w:r>
           </w:p>
         </w:tc>
@@ -680,7 +693,7 @@
           <w:sz w:val="22"/>
           <w:szCs w:val="22"/>
         </w:rPr>
-        <w:t>Dot Net 3.5, 4.6 and 6, Python, Java, JavaScript, C++,  C</w:t>
+        <w:t>Dot Net 3.5, 4.6 and 6, Python, Java, JavaScript, C++, C</w:t>
       </w:r>
     </w:p>
     <w:p>
@@ -712,15 +725,7 @@
           <w:sz w:val="22"/>
           <w:szCs w:val="22"/>
         </w:rPr>
-        <w:t xml:space="preserve"> Microsoft SQL, MySQL, MariaDB, Postgre</w:t>
-      </w:r>
-      <w:r>
-        <w:rPr>
-          <w:rFonts w:ascii="Calibri" w:hAnsi="Calibri" w:asciiTheme="minorHAnsi" w:hAnsiTheme="minorHAnsi"/>
-          <w:sz w:val="22"/>
-          <w:szCs w:val="22"/>
-        </w:rPr>
-        <w:t>s</w:t>
+        <w:t xml:space="preserve"> Microsoft SQL, MySQL, MariaDB, Postgres</w:t>
       </w:r>
     </w:p>
     <w:p>
@@ -1133,8 +1138,8 @@
       </w:tblPr>
       <w:tblGrid>
         <w:gridCol w:w="445"/>
-        <w:gridCol w:w="1976"/>
-        <w:gridCol w:w="7649"/>
+        <w:gridCol w:w="1975"/>
+        <w:gridCol w:w="7650"/>
       </w:tblGrid>
       <w:tr>
         <w:trPr/>
@@ -1192,7 +1197,7 @@
         </w:tc>
         <w:tc>
           <w:tcPr>
-            <w:tcW w:w="1976" w:type="dxa"/>
+            <w:tcW w:w="1975" w:type="dxa"/>
             <w:tcBorders>
               <w:top w:val="nil"/>
               <w:left w:val="nil"/>
@@ -1247,7 +1252,7 @@
         </w:tc>
         <w:tc>
           <w:tcPr>
-            <w:tcW w:w="7649" w:type="dxa"/>
+            <w:tcW w:w="7650" w:type="dxa"/>
             <w:tcBorders>
               <w:top w:val="nil"/>
               <w:left w:val="nil"/>
@@ -1276,7 +1281,7 @@
                 <w:szCs w:val="22"/>
                 <w:lang w:val="en-US" w:eastAsia="en-US" w:bidi="ar-SA"/>
               </w:rPr>
-              <w:t xml:space="preserve">On-Premise (air-gaped secure environment)  </w:t>
+              <w:t>Azure Government Cloud</w:t>
             </w:r>
           </w:p>
         </w:tc>
@@ -1322,7 +1327,7 @@
         </w:tc>
         <w:tc>
           <w:tcPr>
-            <w:tcW w:w="1976" w:type="dxa"/>
+            <w:tcW w:w="1975" w:type="dxa"/>
             <w:tcBorders>
               <w:top w:val="nil"/>
               <w:left w:val="nil"/>
@@ -1364,7 +1369,7 @@
         </w:tc>
         <w:tc>
           <w:tcPr>
-            <w:tcW w:w="7649" w:type="dxa"/>
+            <w:tcW w:w="7650" w:type="dxa"/>
             <w:tcBorders>
               <w:top w:val="nil"/>
               <w:left w:val="nil"/>
@@ -1395,10 +1400,10 @@
                 <w:rFonts w:eastAsia="Times New Roman" w:cs="Times New Roman" w:ascii="Calibri" w:hAnsi="Calibri"/>
                 <w:kern w:val="0"/>
                 <w:sz w:val="22"/>
-                <w:szCs w:val="22"/>
-                <w:lang w:val="en-US" w:eastAsia="en-US" w:bidi="ar-SA"/>
-              </w:rPr>
-              <w:t>Idemia Driver 360</w:t>
+                <w:szCs w:val="20"/>
+                <w:lang w:val="en-US" w:eastAsia="en-US" w:bidi="ar-SA"/>
+              </w:rPr>
+              <w:t xml:space="preserve">Multi-Biometric Identification Software (MBIS) Proprietary software developed by Idemia for identification and classification of soft and hard bio-markers. </w:t>
             </w:r>
           </w:p>
         </w:tc>
@@ -1444,7 +1449,7 @@
         </w:tc>
         <w:tc>
           <w:tcPr>
-            <w:tcW w:w="1976" w:type="dxa"/>
+            <w:tcW w:w="1975" w:type="dxa"/>
             <w:tcBorders>
               <w:top w:val="nil"/>
               <w:left w:val="nil"/>
@@ -1486,7 +1491,7 @@
         </w:tc>
         <w:tc>
           <w:tcPr>
-            <w:tcW w:w="7649" w:type="dxa"/>
+            <w:tcW w:w="7650" w:type="dxa"/>
             <w:tcBorders>
               <w:top w:val="nil"/>
               <w:left w:val="nil"/>
@@ -1520,9 +1525,23 @@
                 <w:szCs w:val="22"/>
                 <w:lang w:val="en-US" w:eastAsia="en-US" w:bidi="ar-SA"/>
               </w:rPr>
-              <w:t xml:space="preserve">Lead DevOps Engineer, Systems Administrator, Lead Tier 3 Support </w:t>
-            </w:r>
-          </w:p>
+              <w:t xml:space="preserve">Lead DevOps Engineer (lead a team of 3 engineers deploying across many states) </w:t>
+            </w:r>
+          </w:p>
+        </w:tc>
+      </w:tr>
+      <w:tr>
+        <w:trPr/>
+        <w:tc>
+          <w:tcPr>
+            <w:tcW w:w="445" w:type="dxa"/>
+            <w:tcBorders>
+              <w:top w:val="nil"/>
+              <w:left w:val="nil"/>
+              <w:bottom w:val="nil"/>
+              <w:right w:val="nil"/>
+            </w:tcBorders>
+          </w:tcPr>
           <w:p>
             <w:pPr>
               <w:pStyle w:val="Normal"/>
@@ -1543,22 +1562,58 @@
             </w:pPr>
             <w:r>
               <w:rPr>
-                <w:rFonts w:eastAsia="Times New Roman" w:cs="Times New Roman" w:ascii="Calibri" w:hAnsi="Calibri"/>
-                <w:kern w:val="0"/>
-                <w:sz w:val="22"/>
-                <w:szCs w:val="22"/>
-                <w:lang w:val="en-US" w:eastAsia="en-US" w:bidi="ar-SA"/>
-              </w:rPr>
-              <w:t xml:space="preserve">(lead a team of 4 engineers to deploy out to Oklahoma environments) </w:t>
-            </w:r>
-          </w:p>
-        </w:tc>
-      </w:tr>
-      <w:tr>
-        <w:trPr/>
-        <w:tc>
-          <w:tcPr>
-            <w:tcW w:w="445" w:type="dxa"/>
+                <w:rFonts w:ascii="Calibri" w:hAnsi="Calibri"/>
+                <w:sz w:val="22"/>
+                <w:szCs w:val="22"/>
+              </w:rPr>
+            </w:r>
+          </w:p>
+        </w:tc>
+        <w:tc>
+          <w:tcPr>
+            <w:tcW w:w="1975" w:type="dxa"/>
+            <w:tcBorders>
+              <w:top w:val="nil"/>
+              <w:left w:val="nil"/>
+              <w:bottom w:val="nil"/>
+              <w:right w:val="nil"/>
+            </w:tcBorders>
+          </w:tcPr>
+          <w:p>
+            <w:pPr>
+              <w:pStyle w:val="Normal"/>
+              <w:widowControl w:val="false"/>
+              <w:suppressAutoHyphens w:val="true"/>
+              <w:spacing w:before="0" w:after="0"/>
+              <w:jc w:val="left"/>
+              <w:rPr>
+                <w:rFonts w:ascii="Calibri" w:hAnsi="Calibri" w:cs="Calibri"/>
+                <w:b/>
+                <w:b/>
+                <w:bCs/>
+                <w:iCs/>
+                <w:sz w:val="22"/>
+                <w:szCs w:val="22"/>
+              </w:rPr>
+            </w:pPr>
+            <w:r>
+              <w:rPr>
+                <w:rFonts w:eastAsia="Times New Roman" w:cs="Calibri" w:ascii="Calibri" w:hAnsi="Calibri"/>
+                <w:b/>
+                <w:bCs/>
+                <w:iCs/>
+                <w:kern w:val="0"/>
+                <w:sz w:val="22"/>
+                <w:szCs w:val="22"/>
+                <w:lang w:val="en-US" w:eastAsia="en-US" w:bidi="ar-SA"/>
+              </w:rPr>
+              <w:t>Project Duration:</w:t>
+            </w:r>
+          </w:p>
+        </w:tc>
+        <w:tc>
+          <w:tcPr>
+            <w:tcW w:w="7650" w:type="dxa"/>
             <w:tcBorders>
               <w:top w:val="nil"/>
               <w:left w:val="nil"/>
@@ -1586,16 +1641,22 @@
             </w:pPr>
             <w:r>
               <w:rPr>
-                <w:rFonts w:ascii="Calibri" w:hAnsi="Calibri"/>
-                <w:sz w:val="22"/>
-                <w:szCs w:val="22"/>
-              </w:rPr>
-            </w:r>
-          </w:p>
-        </w:tc>
-        <w:tc>
-          <w:tcPr>
-            <w:tcW w:w="1976" w:type="dxa"/>
+                <w:rFonts w:eastAsia="Times New Roman" w:cs="Times New Roman" w:ascii="Calibri" w:hAnsi="Calibri"/>
+                <w:kern w:val="0"/>
+                <w:sz w:val="22"/>
+                <w:szCs w:val="22"/>
+                <w:lang w:val="en-US" w:eastAsia="en-US" w:bidi="ar-SA"/>
+              </w:rPr>
+              <w:t>5 Months</w:t>
+            </w:r>
+          </w:p>
+        </w:tc>
+      </w:tr>
+      <w:tr>
+        <w:trPr/>
+        <w:tc>
+          <w:tcPr>
+            <w:tcW w:w="445" w:type="dxa"/>
             <w:tcBorders>
               <w:top w:val="nil"/>
               <w:left w:val="nil"/>
@@ -1607,8 +1668,50 @@
             <w:pPr>
               <w:pStyle w:val="Normal"/>
               <w:widowControl w:val="false"/>
-              <w:suppressAutoHyphens w:val="true"/>
-              <w:spacing w:before="0" w:after="0"/>
+              <w:tabs>
+                <w:tab w:val="clear" w:pos="720"/>
+                <w:tab w:val="right" w:pos="2646" w:leader="none"/>
+                <w:tab w:val="right" w:pos="9180" w:leader="none"/>
+              </w:tabs>
+              <w:suppressAutoHyphens w:val="true"/>
+              <w:spacing w:lineRule="atLeast" w:line="260" w:before="0" w:after="120"/>
+              <w:jc w:val="left"/>
+              <w:rPr>
+                <w:rFonts w:ascii="Calibri" w:hAnsi="Calibri"/>
+                <w:sz w:val="22"/>
+                <w:szCs w:val="22"/>
+              </w:rPr>
+            </w:pPr>
+            <w:r>
+              <w:rPr>
+                <w:rFonts w:ascii="Calibri" w:hAnsi="Calibri"/>
+                <w:sz w:val="22"/>
+                <w:szCs w:val="22"/>
+              </w:rPr>
+            </w:r>
+          </w:p>
+        </w:tc>
+        <w:tc>
+          <w:tcPr>
+            <w:tcW w:w="1975" w:type="dxa"/>
+            <w:tcBorders>
+              <w:top w:val="nil"/>
+              <w:left w:val="nil"/>
+              <w:bottom w:val="nil"/>
+              <w:right w:val="nil"/>
+            </w:tcBorders>
+          </w:tcPr>
+          <w:p>
+            <w:pPr>
+              <w:pStyle w:val="Normal"/>
+              <w:widowControl w:val="false"/>
+              <w:tabs>
+                <w:tab w:val="clear" w:pos="720"/>
+                <w:tab w:val="right" w:pos="2646" w:leader="none"/>
+                <w:tab w:val="right" w:pos="9180" w:leader="none"/>
+              </w:tabs>
+              <w:suppressAutoHyphens w:val="true"/>
+              <w:spacing w:lineRule="atLeast" w:line="260" w:before="0" w:after="120"/>
               <w:jc w:val="left"/>
               <w:rPr>
                 <w:rFonts w:ascii="Calibri" w:hAnsi="Calibri" w:cs="Calibri"/>
@@ -1631,13 +1734,81 @@
                 <w:szCs w:val="22"/>
                 <w:lang w:val="en-US" w:eastAsia="en-US" w:bidi="ar-SA"/>
               </w:rPr>
-              <w:t>Project Duration:</w:t>
-            </w:r>
-          </w:p>
-        </w:tc>
-        <w:tc>
-          <w:tcPr>
-            <w:tcW w:w="7649" w:type="dxa"/>
+              <w:t>Responsibilities:</w:t>
+            </w:r>
+          </w:p>
+        </w:tc>
+        <w:tc>
+          <w:tcPr>
+            <w:tcW w:w="7650" w:type="dxa"/>
+            <w:tcBorders>
+              <w:top w:val="nil"/>
+              <w:left w:val="nil"/>
+              <w:bottom w:val="nil"/>
+              <w:right w:val="nil"/>
+            </w:tcBorders>
+          </w:tcPr>
+          <w:p>
+            <w:pPr>
+              <w:pStyle w:val="Normal"/>
+              <w:widowControl w:val="false"/>
+              <w:numPr>
+                <w:ilvl w:val="0"/>
+                <w:numId w:val="2"/>
+              </w:numPr>
+              <w:suppressAutoHyphens w:val="true"/>
+              <w:spacing w:before="60" w:after="0"/>
+              <w:jc w:val="left"/>
+              <w:rPr>
+                <w:rFonts w:ascii="Calibri" w:hAnsi="Calibri" w:cs="Calibri"/>
+                <w:sz w:val="22"/>
+              </w:rPr>
+            </w:pPr>
+            <w:r>
+              <w:rPr>
+                <w:rFonts w:eastAsia="Times New Roman" w:cs="Calibri" w:ascii="Calibri" w:hAnsi="Calibri"/>
+                <w:kern w:val="0"/>
+                <w:sz w:val="22"/>
+                <w:szCs w:val="20"/>
+                <w:lang w:val="en-US" w:eastAsia="en-US" w:bidi="ar-SA"/>
+              </w:rPr>
+              <w:t xml:space="preserve">Deployment of Ansible Scripts to install custom RPM packages to deployed RHEL servers. </w:t>
+            </w:r>
+          </w:p>
+          <w:p>
+            <w:pPr>
+              <w:pStyle w:val="Normal"/>
+              <w:widowControl w:val="false"/>
+              <w:numPr>
+                <w:ilvl w:val="0"/>
+                <w:numId w:val="2"/>
+              </w:numPr>
+              <w:suppressAutoHyphens w:val="true"/>
+              <w:spacing w:before="60" w:after="0"/>
+              <w:jc w:val="left"/>
+              <w:rPr>
+                <w:rFonts w:ascii="Calibri" w:hAnsi="Calibri" w:cs="Calibri"/>
+                <w:sz w:val="22"/>
+              </w:rPr>
+            </w:pPr>
+            <w:r>
+              <w:rPr>
+                <w:rFonts w:eastAsia="Times New Roman" w:cs="Calibri" w:ascii="Calibri" w:hAnsi="Calibri"/>
+                <w:kern w:val="0"/>
+                <w:sz w:val="22"/>
+                <w:szCs w:val="20"/>
+                <w:lang w:val="en-US" w:eastAsia="en-US" w:bidi="ar-SA"/>
+              </w:rPr>
+              <w:t xml:space="preserve">Create and edit Ansible scripts to continue development of the pipeline.  </w:t>
+            </w:r>
+          </w:p>
+        </w:tc>
+      </w:tr>
+      <w:tr>
+        <w:trPr/>
+        <w:tc>
+          <w:tcPr>
+            <w:tcW w:w="445" w:type="dxa"/>
             <w:tcBorders>
               <w:top w:val="nil"/>
               <w:left w:val="nil"/>
@@ -1665,22 +1836,58 @@
             </w:pPr>
             <w:r>
               <w:rPr>
-                <w:rFonts w:eastAsia="Times New Roman" w:cs="Times New Roman" w:ascii="Calibri" w:hAnsi="Calibri"/>
-                <w:kern w:val="0"/>
-                <w:sz w:val="22"/>
-                <w:szCs w:val="22"/>
-                <w:lang w:val="en-US" w:eastAsia="en-US" w:bidi="ar-SA"/>
-              </w:rPr>
-              <w:t>2 years 6 Months</w:t>
-            </w:r>
-          </w:p>
-        </w:tc>
-      </w:tr>
-      <w:tr>
-        <w:trPr/>
-        <w:tc>
-          <w:tcPr>
-            <w:tcW w:w="445" w:type="dxa"/>
+                <w:rFonts w:ascii="Calibri" w:hAnsi="Calibri"/>
+                <w:sz w:val="22"/>
+                <w:szCs w:val="22"/>
+              </w:rPr>
+            </w:r>
+          </w:p>
+        </w:tc>
+        <w:tc>
+          <w:tcPr>
+            <w:tcW w:w="1975" w:type="dxa"/>
+            <w:tcBorders>
+              <w:top w:val="nil"/>
+              <w:left w:val="nil"/>
+              <w:bottom w:val="nil"/>
+              <w:right w:val="nil"/>
+            </w:tcBorders>
+          </w:tcPr>
+          <w:p>
+            <w:pPr>
+              <w:pStyle w:val="Normal"/>
+              <w:widowControl w:val="false"/>
+              <w:suppressAutoHyphens w:val="true"/>
+              <w:spacing w:before="0" w:after="0"/>
+              <w:jc w:val="left"/>
+              <w:rPr>
+                <w:rFonts w:ascii="Calibri" w:hAnsi="Calibri" w:cs="Calibri"/>
+                <w:b/>
+                <w:b/>
+                <w:bCs/>
+                <w:iCs/>
+                <w:sz w:val="22"/>
+                <w:szCs w:val="22"/>
+              </w:rPr>
+            </w:pPr>
+            <w:r>
+              <w:rPr>
+                <w:rFonts w:eastAsia="Times New Roman" w:cs="Calibri" w:ascii="Calibri" w:hAnsi="Calibri"/>
+                <w:b/>
+                <w:bCs/>
+                <w:iCs/>
+                <w:kern w:val="0"/>
+                <w:sz w:val="22"/>
+                <w:szCs w:val="22"/>
+                <w:lang w:val="en-US" w:eastAsia="en-US" w:bidi="ar-SA"/>
+              </w:rPr>
+              <w:t>Operating Systems:</w:t>
+            </w:r>
+          </w:p>
+        </w:tc>
+        <w:tc>
+          <w:tcPr>
+            <w:tcW w:w="7650" w:type="dxa"/>
             <w:tcBorders>
               <w:top w:val="nil"/>
               <w:left w:val="nil"/>
@@ -1708,16 +1915,22 @@
             </w:pPr>
             <w:r>
               <w:rPr>
-                <w:rFonts w:ascii="Calibri" w:hAnsi="Calibri"/>
-                <w:sz w:val="22"/>
-                <w:szCs w:val="22"/>
-              </w:rPr>
-            </w:r>
-          </w:p>
-        </w:tc>
-        <w:tc>
-          <w:tcPr>
-            <w:tcW w:w="1976" w:type="dxa"/>
+                <w:rFonts w:eastAsia="Times New Roman" w:cs="Times New Roman" w:ascii="Calibri" w:hAnsi="Calibri"/>
+                <w:kern w:val="0"/>
+                <w:sz w:val="22"/>
+                <w:szCs w:val="22"/>
+                <w:lang w:val="en-US" w:eastAsia="en-US" w:bidi="ar-SA"/>
+              </w:rPr>
+              <w:t xml:space="preserve">RHEL, CentOS 8 - Kernel 4.18 </w:t>
+            </w:r>
+          </w:p>
+        </w:tc>
+      </w:tr>
+      <w:tr>
+        <w:trPr/>
+        <w:tc>
+          <w:tcPr>
+            <w:tcW w:w="445" w:type="dxa"/>
             <w:tcBorders>
               <w:top w:val="nil"/>
               <w:left w:val="nil"/>
@@ -1738,182 +1951,23 @@
               <w:spacing w:lineRule="atLeast" w:line="260" w:before="0" w:after="120"/>
               <w:jc w:val="left"/>
               <w:rPr>
-                <w:rFonts w:ascii="Calibri" w:hAnsi="Calibri" w:cs="Calibri"/>
-                <w:b/>
-                <w:b/>
-                <w:bCs/>
-                <w:iCs/>
-                <w:sz w:val="22"/>
-                <w:szCs w:val="22"/>
-              </w:rPr>
-            </w:pPr>
-            <w:r>
-              <w:rPr>
-                <w:rFonts w:eastAsia="Times New Roman" w:cs="Calibri" w:ascii="Calibri" w:hAnsi="Calibri"/>
-                <w:b/>
-                <w:bCs/>
-                <w:iCs/>
-                <w:kern w:val="0"/>
-                <w:sz w:val="22"/>
-                <w:szCs w:val="22"/>
-                <w:lang w:val="en-US" w:eastAsia="en-US" w:bidi="ar-SA"/>
-              </w:rPr>
-              <w:t>Responsibilities:</w:t>
-            </w:r>
-          </w:p>
-        </w:tc>
-        <w:tc>
-          <w:tcPr>
-            <w:tcW w:w="7649" w:type="dxa"/>
-            <w:tcBorders>
-              <w:top w:val="nil"/>
-              <w:left w:val="nil"/>
-              <w:bottom w:val="nil"/>
-              <w:right w:val="nil"/>
-            </w:tcBorders>
-          </w:tcPr>
-          <w:p>
-            <w:pPr>
-              <w:pStyle w:val="Normal"/>
-              <w:widowControl w:val="false"/>
-              <w:numPr>
-                <w:ilvl w:val="0"/>
-                <w:numId w:val="2"/>
-              </w:numPr>
-              <w:suppressAutoHyphens w:val="true"/>
-              <w:spacing w:before="60" w:after="0"/>
-              <w:jc w:val="left"/>
-              <w:rPr>
-                <w:rFonts w:ascii="Calibri" w:hAnsi="Calibri" w:cs="Calibri"/>
-                <w:sz w:val="22"/>
-              </w:rPr>
-            </w:pPr>
-            <w:r>
-              <w:rPr>
-                <w:rFonts w:eastAsia="Times New Roman" w:cs="Calibri" w:ascii="Calibri" w:hAnsi="Calibri"/>
-                <w:kern w:val="0"/>
-                <w:sz w:val="22"/>
-                <w:szCs w:val="20"/>
-                <w:lang w:val="en-US" w:eastAsia="en-US" w:bidi="ar-SA"/>
-              </w:rPr>
-              <w:t>Develop Pipeline and entire CI/CD process for promotion of Back-Office code to Production Systems</w:t>
-            </w:r>
-          </w:p>
-          <w:p>
-            <w:pPr>
-              <w:pStyle w:val="Normal"/>
-              <w:widowControl w:val="false"/>
-              <w:numPr>
-                <w:ilvl w:val="0"/>
-                <w:numId w:val="2"/>
-              </w:numPr>
-              <w:suppressAutoHyphens w:val="true"/>
-              <w:spacing w:before="60" w:after="0"/>
-              <w:jc w:val="left"/>
-              <w:rPr>
-                <w:rFonts w:ascii="Calibri" w:hAnsi="Calibri" w:cs="Calibri"/>
-                <w:sz w:val="22"/>
-              </w:rPr>
-            </w:pPr>
-            <w:r>
-              <w:rPr>
-                <w:rFonts w:eastAsia="Times New Roman" w:cs="Calibri" w:ascii="Calibri" w:hAnsi="Calibri"/>
-                <w:kern w:val="0"/>
-                <w:sz w:val="22"/>
-                <w:szCs w:val="20"/>
-                <w:lang w:val="en-US" w:eastAsia="en-US" w:bidi="ar-SA"/>
-              </w:rPr>
-              <w:t>Manage MoveIT, Pentaho, and External Interface connectivity to subsidiary systems</w:t>
-            </w:r>
-          </w:p>
-          <w:p>
-            <w:pPr>
-              <w:pStyle w:val="Normal"/>
-              <w:widowControl w:val="false"/>
-              <w:numPr>
-                <w:ilvl w:val="0"/>
-                <w:numId w:val="2"/>
-              </w:numPr>
-              <w:suppressAutoHyphens w:val="true"/>
-              <w:spacing w:before="60" w:after="0"/>
-              <w:jc w:val="left"/>
-              <w:rPr>
-                <w:rFonts w:ascii="Calibri" w:hAnsi="Calibri" w:cs="Calibri"/>
-                <w:sz w:val="22"/>
-              </w:rPr>
-            </w:pPr>
-            <w:r>
-              <w:rPr>
-                <w:rFonts w:eastAsia="Times New Roman" w:cs="Calibri" w:ascii="Calibri" w:hAnsi="Calibri"/>
-                <w:kern w:val="0"/>
-                <w:sz w:val="22"/>
-                <w:szCs w:val="20"/>
-                <w:lang w:val="en-US" w:eastAsia="en-US" w:bidi="ar-SA"/>
-              </w:rPr>
-              <w:t>Deployment of all code and validation of deployment process</w:t>
-            </w:r>
-          </w:p>
-          <w:p>
-            <w:pPr>
-              <w:pStyle w:val="Normal"/>
-              <w:widowControl w:val="false"/>
-              <w:numPr>
-                <w:ilvl w:val="0"/>
-                <w:numId w:val="2"/>
-              </w:numPr>
-              <w:suppressAutoHyphens w:val="true"/>
-              <w:spacing w:before="60" w:after="0"/>
-              <w:jc w:val="left"/>
-              <w:rPr>
-                <w:rFonts w:ascii="Calibri" w:hAnsi="Calibri" w:cs="Calibri"/>
-                <w:sz w:val="22"/>
-              </w:rPr>
-            </w:pPr>
-            <w:r>
-              <w:rPr>
-                <w:rFonts w:eastAsia="Times New Roman" w:cs="Calibri" w:ascii="Calibri" w:hAnsi="Calibri"/>
-                <w:kern w:val="0"/>
-                <w:sz w:val="22"/>
-                <w:szCs w:val="20"/>
-                <w:lang w:val="en-US" w:eastAsia="en-US" w:bidi="ar-SA"/>
-              </w:rPr>
-              <w:t>Lead deployment of new environments and maintain the infrastructure of existing environments.</w:t>
-            </w:r>
-          </w:p>
-          <w:p>
-            <w:pPr>
-              <w:pStyle w:val="Normal"/>
-              <w:widowControl w:val="false"/>
-              <w:numPr>
-                <w:ilvl w:val="0"/>
-                <w:numId w:val="2"/>
-              </w:numPr>
-              <w:suppressAutoHyphens w:val="true"/>
-              <w:spacing w:before="60" w:after="0"/>
-              <w:jc w:val="left"/>
-              <w:rPr>
-                <w:rFonts w:ascii="Calibri" w:hAnsi="Calibri" w:cs="Calibri"/>
-                <w:sz w:val="22"/>
-              </w:rPr>
-            </w:pPr>
-            <w:r>
-              <w:rPr>
-                <w:rFonts w:eastAsia="Times New Roman" w:cs="Calibri" w:ascii="Calibri" w:hAnsi="Calibri"/>
-                <w:kern w:val="0"/>
-                <w:sz w:val="22"/>
-                <w:szCs w:val="20"/>
-                <w:lang w:val="en-US" w:eastAsia="en-US" w:bidi="ar-SA"/>
-              </w:rPr>
-              <w:t xml:space="preserve">Lead for security and auditing of the systems in production. Control over all user accounts and maintenance and updates to systems. </w:t>
-            </w:r>
-          </w:p>
-        </w:tc>
-      </w:tr>
-      <w:tr>
-        <w:trPr/>
-        <w:tc>
-          <w:tcPr>
-            <w:tcW w:w="445" w:type="dxa"/>
+                <w:rFonts w:ascii="Calibri" w:hAnsi="Calibri"/>
+                <w:sz w:val="22"/>
+                <w:szCs w:val="22"/>
+              </w:rPr>
+            </w:pPr>
+            <w:r>
+              <w:rPr>
+                <w:rFonts w:ascii="Calibri" w:hAnsi="Calibri"/>
+                <w:sz w:val="22"/>
+                <w:szCs w:val="22"/>
+              </w:rPr>
+            </w:r>
+          </w:p>
+        </w:tc>
+        <w:tc>
+          <w:tcPr>
+            <w:tcW w:w="1975" w:type="dxa"/>
             <w:tcBorders>
               <w:top w:val="nil"/>
               <w:left w:val="nil"/>
@@ -1941,42 +1995,6 @@
             </w:pPr>
             <w:r>
               <w:rPr>
-                <w:rFonts w:ascii="Calibri" w:hAnsi="Calibri"/>
-                <w:sz w:val="22"/>
-                <w:szCs w:val="22"/>
-              </w:rPr>
-            </w:r>
-          </w:p>
-        </w:tc>
-        <w:tc>
-          <w:tcPr>
-            <w:tcW w:w="1976" w:type="dxa"/>
-            <w:tcBorders>
-              <w:top w:val="nil"/>
-              <w:left w:val="nil"/>
-              <w:bottom w:val="nil"/>
-              <w:right w:val="nil"/>
-            </w:tcBorders>
-          </w:tcPr>
-          <w:p>
-            <w:pPr>
-              <w:pStyle w:val="Normal"/>
-              <w:widowControl w:val="false"/>
-              <w:suppressAutoHyphens w:val="true"/>
-              <w:spacing w:before="0" w:after="0"/>
-              <w:jc w:val="left"/>
-              <w:rPr>
-                <w:rFonts w:ascii="Calibri" w:hAnsi="Calibri" w:cs="Calibri"/>
-                <w:b/>
-                <w:b/>
-                <w:bCs/>
-                <w:iCs/>
-                <w:sz w:val="22"/>
-                <w:szCs w:val="22"/>
-              </w:rPr>
-            </w:pPr>
-            <w:r>
-              <w:rPr>
                 <w:rFonts w:eastAsia="Times New Roman" w:cs="Calibri" w:ascii="Calibri" w:hAnsi="Calibri"/>
                 <w:b/>
                 <w:bCs/>
@@ -1986,13 +2004,13 @@
                 <w:szCs w:val="22"/>
                 <w:lang w:val="en-US" w:eastAsia="en-US" w:bidi="ar-SA"/>
               </w:rPr>
-              <w:t>Operating Systems:</w:t>
-            </w:r>
-          </w:p>
-        </w:tc>
-        <w:tc>
-          <w:tcPr>
-            <w:tcW w:w="7649" w:type="dxa"/>
+              <w:t>Software / Languages:</w:t>
+            </w:r>
+          </w:p>
+        </w:tc>
+        <w:tc>
+          <w:tcPr>
+            <w:tcW w:w="7650" w:type="dxa"/>
             <w:tcBorders>
               <w:top w:val="nil"/>
               <w:left w:val="nil"/>
@@ -2026,7 +2044,7 @@
                 <w:szCs w:val="22"/>
                 <w:lang w:val="en-US" w:eastAsia="en-US" w:bidi="ar-SA"/>
               </w:rPr>
-              <w:t>Windows Server 2016 (Release 1607 10.0.14393.5066)</w:t>
+              <w:t>Ansible, BASH Scripting</w:t>
             </w:r>
           </w:p>
         </w:tc>
@@ -2072,7 +2090,7 @@
         </w:tc>
         <w:tc>
           <w:tcPr>
-            <w:tcW w:w="1976" w:type="dxa"/>
+            <w:tcW w:w="1975" w:type="dxa"/>
             <w:tcBorders>
               <w:top w:val="nil"/>
               <w:left w:val="nil"/>
@@ -2109,13 +2127,13 @@
                 <w:szCs w:val="22"/>
                 <w:lang w:val="en-US" w:eastAsia="en-US" w:bidi="ar-SA"/>
               </w:rPr>
-              <w:t>Software / Languages:</w:t>
-            </w:r>
-          </w:p>
-        </w:tc>
-        <w:tc>
-          <w:tcPr>
-            <w:tcW w:w="7649" w:type="dxa"/>
+              <w:t>Special Tools:</w:t>
+            </w:r>
+          </w:p>
+        </w:tc>
+        <w:tc>
+          <w:tcPr>
+            <w:tcW w:w="7650" w:type="dxa"/>
             <w:tcBorders>
               <w:top w:val="nil"/>
               <w:left w:val="nil"/>
@@ -2149,292 +2167,29 @@
                 <w:szCs w:val="22"/>
                 <w:lang w:val="en-US" w:eastAsia="en-US" w:bidi="ar-SA"/>
               </w:rPr>
-              <w:t xml:space="preserve">.NET 4.6.2, PowerShell, JavaScript, Microsoft SQL </w:t>
-            </w:r>
-          </w:p>
-        </w:tc>
-      </w:tr>
-      <w:tr>
-        <w:trPr/>
-        <w:tc>
-          <w:tcPr>
-            <w:tcW w:w="445" w:type="dxa"/>
-            <w:tcBorders>
-              <w:top w:val="nil"/>
-              <w:left w:val="nil"/>
-              <w:bottom w:val="nil"/>
-              <w:right w:val="nil"/>
-            </w:tcBorders>
-          </w:tcPr>
-          <w:p>
-            <w:pPr>
-              <w:pStyle w:val="Normal"/>
-              <w:widowControl w:val="false"/>
-              <w:tabs>
-                <w:tab w:val="clear" w:pos="720"/>
-                <w:tab w:val="right" w:pos="2646" w:leader="none"/>
-                <w:tab w:val="right" w:pos="9180" w:leader="none"/>
-              </w:tabs>
-              <w:suppressAutoHyphens w:val="true"/>
-              <w:spacing w:lineRule="atLeast" w:line="260" w:before="0" w:after="120"/>
-              <w:jc w:val="left"/>
-              <w:rPr>
-                <w:rFonts w:ascii="Calibri" w:hAnsi="Calibri"/>
-                <w:sz w:val="22"/>
-                <w:szCs w:val="22"/>
-              </w:rPr>
-            </w:pPr>
-            <w:r>
-              <w:rPr>
-                <w:rFonts w:ascii="Calibri" w:hAnsi="Calibri"/>
-                <w:sz w:val="22"/>
-                <w:szCs w:val="22"/>
-              </w:rPr>
-            </w:r>
-          </w:p>
-        </w:tc>
-        <w:tc>
-          <w:tcPr>
-            <w:tcW w:w="1976" w:type="dxa"/>
-            <w:tcBorders>
-              <w:top w:val="nil"/>
-              <w:left w:val="nil"/>
-              <w:bottom w:val="nil"/>
-              <w:right w:val="nil"/>
-            </w:tcBorders>
-          </w:tcPr>
-          <w:p>
-            <w:pPr>
-              <w:pStyle w:val="Normal"/>
-              <w:widowControl w:val="false"/>
-              <w:tabs>
-                <w:tab w:val="clear" w:pos="720"/>
-                <w:tab w:val="right" w:pos="2646" w:leader="none"/>
-                <w:tab w:val="right" w:pos="9180" w:leader="none"/>
-              </w:tabs>
-              <w:suppressAutoHyphens w:val="true"/>
-              <w:spacing w:lineRule="atLeast" w:line="260" w:before="0" w:after="120"/>
-              <w:jc w:val="left"/>
-              <w:rPr>
-                <w:rFonts w:ascii="Calibri" w:hAnsi="Calibri"/>
-                <w:sz w:val="22"/>
-                <w:szCs w:val="22"/>
-              </w:rPr>
-            </w:pPr>
-            <w:r>
-              <w:rPr>
-                <w:rFonts w:eastAsia="Times New Roman" w:cs="Calibri" w:ascii="Calibri" w:hAnsi="Calibri"/>
-                <w:b/>
-                <w:bCs/>
-                <w:iCs/>
-                <w:kern w:val="0"/>
-                <w:sz w:val="22"/>
-                <w:szCs w:val="22"/>
-                <w:lang w:val="en-US" w:eastAsia="en-US" w:bidi="ar-SA"/>
-              </w:rPr>
-              <w:t>Special Tools:</w:t>
-            </w:r>
-          </w:p>
-        </w:tc>
-        <w:tc>
-          <w:tcPr>
-            <w:tcW w:w="7649" w:type="dxa"/>
-            <w:tcBorders>
-              <w:top w:val="nil"/>
-              <w:left w:val="nil"/>
-              <w:bottom w:val="nil"/>
-              <w:right w:val="nil"/>
-            </w:tcBorders>
-          </w:tcPr>
-          <w:p>
-            <w:pPr>
-              <w:pStyle w:val="Normal"/>
-              <w:widowControl w:val="false"/>
-              <w:tabs>
-                <w:tab w:val="clear" w:pos="720"/>
-                <w:tab w:val="right" w:pos="2646" w:leader="none"/>
-                <w:tab w:val="right" w:pos="9180" w:leader="none"/>
-              </w:tabs>
-              <w:suppressAutoHyphens w:val="true"/>
-              <w:spacing w:lineRule="atLeast" w:line="260" w:before="0" w:after="120"/>
-              <w:jc w:val="left"/>
-              <w:rPr>
-                <w:rFonts w:ascii="Calibri" w:hAnsi="Calibri"/>
-                <w:sz w:val="22"/>
-                <w:szCs w:val="22"/>
-              </w:rPr>
-            </w:pPr>
-            <w:hyperlink r:id="rId13">
-              <w:r>
-                <w:rPr>
-                  <w:rStyle w:val="InternetLink"/>
-                  <w:rFonts w:eastAsia="Times New Roman" w:cs="Times New Roman" w:ascii="Calibri" w:hAnsi="Calibri"/>
-                  <w:kern w:val="0"/>
-                  <w:sz w:val="22"/>
-                  <w:szCs w:val="22"/>
-                  <w:lang w:val="en-US" w:eastAsia="en-US" w:bidi="ar-SA"/>
-                </w:rPr>
-                <w:t>Octopus</w:t>
-              </w:r>
-            </w:hyperlink>
-            <w:r>
-              <w:rPr>
-                <w:rFonts w:eastAsia="Times New Roman" w:cs="Times New Roman" w:ascii="Calibri" w:hAnsi="Calibri"/>
-                <w:kern w:val="0"/>
-                <w:sz w:val="22"/>
-                <w:szCs w:val="22"/>
-                <w:lang w:val="en-US" w:eastAsia="en-US" w:bidi="ar-SA"/>
-              </w:rPr>
-              <w:t xml:space="preserve">, Jenkins, </w:t>
-            </w:r>
-            <w:hyperlink r:id="rId14">
-              <w:r>
-                <w:rPr>
-                  <w:rStyle w:val="InternetLink"/>
-                  <w:rFonts w:eastAsia="Times New Roman" w:cs="Times New Roman" w:ascii="Calibri" w:hAnsi="Calibri"/>
-                  <w:kern w:val="0"/>
-                  <w:sz w:val="22"/>
-                  <w:szCs w:val="22"/>
-                  <w:lang w:val="en-US" w:eastAsia="en-US" w:bidi="ar-SA"/>
-                </w:rPr>
-                <w:t>MoveIT</w:t>
-              </w:r>
-            </w:hyperlink>
-            <w:r>
-              <w:rPr>
-                <w:rFonts w:eastAsia="Times New Roman" w:cs="Times New Roman" w:ascii="Calibri" w:hAnsi="Calibri"/>
-                <w:kern w:val="0"/>
-                <w:sz w:val="22"/>
-                <w:szCs w:val="22"/>
-                <w:lang w:val="en-US" w:eastAsia="en-US" w:bidi="ar-SA"/>
-              </w:rPr>
-              <w:t xml:space="preserve">, </w:t>
-            </w:r>
-            <w:hyperlink r:id="rId15">
-              <w:r>
-                <w:rPr>
-                  <w:rStyle w:val="InternetLink"/>
-                  <w:rFonts w:eastAsia="Times New Roman" w:cs="Times New Roman" w:ascii="Calibri" w:hAnsi="Calibri"/>
-                  <w:kern w:val="0"/>
-                  <w:sz w:val="22"/>
-                  <w:szCs w:val="22"/>
-                  <w:lang w:val="en-US" w:eastAsia="en-US" w:bidi="ar-SA"/>
-                </w:rPr>
-                <w:t>Pentaho</w:t>
-              </w:r>
-            </w:hyperlink>
-            <w:r>
-              <w:rPr>
-                <w:rFonts w:eastAsia="Times New Roman" w:cs="Times New Roman" w:ascii="Calibri" w:hAnsi="Calibri"/>
-                <w:kern w:val="0"/>
-                <w:sz w:val="22"/>
-                <w:szCs w:val="22"/>
-                <w:lang w:val="en-US" w:eastAsia="en-US" w:bidi="ar-SA"/>
-              </w:rPr>
-              <w:t xml:space="preserve">, </w:t>
-            </w:r>
-            <w:hyperlink r:id="rId16">
-              <w:r>
-                <w:rPr>
-                  <w:rStyle w:val="InternetLink"/>
-                  <w:rFonts w:eastAsia="Times New Roman" w:cs="Times New Roman" w:ascii="Calibri" w:hAnsi="Calibri"/>
-                  <w:kern w:val="0"/>
-                  <w:sz w:val="22"/>
-                  <w:szCs w:val="22"/>
-                  <w:lang w:val="en-US" w:eastAsia="en-US" w:bidi="ar-SA"/>
-                </w:rPr>
-                <w:t>MSCRM</w:t>
-              </w:r>
-            </w:hyperlink>
-            <w:r>
-              <w:rPr>
-                <w:rFonts w:eastAsia="Times New Roman" w:cs="Times New Roman" w:ascii="Calibri" w:hAnsi="Calibri"/>
-                <w:kern w:val="0"/>
-                <w:sz w:val="22"/>
-                <w:szCs w:val="22"/>
-                <w:lang w:val="en-US" w:eastAsia="en-US" w:bidi="ar-SA"/>
-              </w:rPr>
-              <w:t xml:space="preserve">, ZScaler, </w:t>
-            </w:r>
-            <w:hyperlink r:id="rId17">
-              <w:r>
-                <w:rPr>
-                  <w:rStyle w:val="InternetLink"/>
-                  <w:rFonts w:eastAsia="Times New Roman" w:cs="Times New Roman" w:ascii="Calibri" w:hAnsi="Calibri"/>
-                  <w:kern w:val="0"/>
-                  <w:sz w:val="22"/>
-                  <w:szCs w:val="22"/>
-                  <w:lang w:val="en-US" w:eastAsia="en-US" w:bidi="ar-SA"/>
-                </w:rPr>
-                <w:t>F5</w:t>
-              </w:r>
-            </w:hyperlink>
-            <w:r>
-              <w:rPr>
-                <w:rFonts w:eastAsia="Times New Roman" w:cs="Times New Roman" w:ascii="Calibri" w:hAnsi="Calibri"/>
-                <w:kern w:val="0"/>
-                <w:sz w:val="22"/>
-                <w:szCs w:val="22"/>
-                <w:lang w:val="en-US" w:eastAsia="en-US" w:bidi="ar-SA"/>
-              </w:rPr>
-              <w:t xml:space="preserve">, IIS. </w:t>
-            </w:r>
-          </w:p>
-          <w:p>
-            <w:pPr>
-              <w:pStyle w:val="Normal"/>
-              <w:widowControl w:val="false"/>
-              <w:tabs>
-                <w:tab w:val="clear" w:pos="720"/>
-                <w:tab w:val="right" w:pos="2646" w:leader="none"/>
-                <w:tab w:val="right" w:pos="9180" w:leader="none"/>
-              </w:tabs>
-              <w:suppressAutoHyphens w:val="true"/>
-              <w:spacing w:lineRule="atLeast" w:line="260" w:before="0" w:after="120"/>
-              <w:jc w:val="left"/>
-              <w:rPr>
-                <w:rFonts w:ascii="Calibri" w:hAnsi="Calibri"/>
-                <w:sz w:val="22"/>
-                <w:szCs w:val="22"/>
-              </w:rPr>
-            </w:pPr>
-            <w:r>
-              <w:rPr>
-                <w:rFonts w:eastAsia="Times New Roman" w:cs="Times New Roman" w:ascii="Calibri" w:hAnsi="Calibri"/>
-                <w:kern w:val="0"/>
-                <w:sz w:val="22"/>
-                <w:szCs w:val="22"/>
-                <w:lang w:val="en-US" w:eastAsia="en-US" w:bidi="ar-SA"/>
-              </w:rPr>
-              <w:t xml:space="preserve">Domain Tools: SCCM, SCOM, LDAP, </w:t>
-            </w:r>
-            <w:hyperlink r:id="rId18">
-              <w:r>
-                <w:rPr>
-                  <w:rStyle w:val="InternetLink"/>
-                  <w:rFonts w:eastAsia="Times New Roman" w:cs="Times New Roman" w:ascii="Calibri" w:hAnsi="Calibri"/>
-                  <w:kern w:val="0"/>
-                  <w:sz w:val="22"/>
-                  <w:szCs w:val="22"/>
-                  <w:lang w:val="en-US" w:eastAsia="en-US" w:bidi="ar-SA"/>
-                </w:rPr>
-                <w:t>Dynatrace</w:t>
-              </w:r>
-            </w:hyperlink>
-            <w:r>
-              <w:rPr>
-                <w:rFonts w:eastAsia="Times New Roman" w:cs="Times New Roman" w:ascii="Calibri" w:hAnsi="Calibri"/>
-                <w:kern w:val="0"/>
-                <w:sz w:val="22"/>
-                <w:szCs w:val="22"/>
-                <w:lang w:val="en-US" w:eastAsia="en-US" w:bidi="ar-SA"/>
-              </w:rPr>
-              <w:t>, Microsoft DNS, DFS FileShare, MS Certificate Store.</w:t>
+              <w:t xml:space="preserve">Ansible, Azure DevOps </w:t>
             </w:r>
           </w:p>
         </w:tc>
       </w:tr>
     </w:tbl>
+    <w:p>
+      <w:pPr>
+        <w:pStyle w:val="Normal"/>
+        <w:rPr>
+          <w:rFonts w:ascii="Calibri" w:hAnsi="Calibri"/>
+          <w:sz w:val="22"/>
+          <w:szCs w:val="22"/>
+        </w:rPr>
+      </w:pPr>
+      <w:r>
+        <w:rPr>
+          <w:rFonts w:ascii="Calibri" w:hAnsi="Calibri"/>
+          <w:sz w:val="22"/>
+          <w:szCs w:val="22"/>
+        </w:rPr>
+      </w:r>
+    </w:p>
     <w:p>
       <w:pPr>
         <w:pStyle w:val="Normal"/>
@@ -2469,8 +2224,8 @@
       </w:tblPr>
       <w:tblGrid>
         <w:gridCol w:w="445"/>
-        <w:gridCol w:w="1976"/>
-        <w:gridCol w:w="7649"/>
+        <w:gridCol w:w="1975"/>
+        <w:gridCol w:w="7650"/>
       </w:tblGrid>
       <w:tr>
         <w:trPr/>
@@ -2528,7 +2283,7 @@
         </w:tc>
         <w:tc>
           <w:tcPr>
-            <w:tcW w:w="1976" w:type="dxa"/>
+            <w:tcW w:w="1975" w:type="dxa"/>
             <w:tcBorders>
               <w:top w:val="nil"/>
               <w:left w:val="nil"/>
@@ -2583,7 +2338,7 @@
         </w:tc>
         <w:tc>
           <w:tcPr>
-            <w:tcW w:w="7649" w:type="dxa"/>
+            <w:tcW w:w="7650" w:type="dxa"/>
             <w:tcBorders>
               <w:top w:val="nil"/>
               <w:left w:val="nil"/>
@@ -2612,7 +2367,7 @@
                 <w:szCs w:val="22"/>
                 <w:lang w:val="en-US" w:eastAsia="en-US" w:bidi="ar-SA"/>
               </w:rPr>
-              <w:t>Azure Government Cloud</w:t>
+              <w:t xml:space="preserve">On-Premise (air-gaped secure environment)  </w:t>
             </w:r>
           </w:p>
         </w:tc>
@@ -2658,7 +2413,7 @@
         </w:tc>
         <w:tc>
           <w:tcPr>
-            <w:tcW w:w="1976" w:type="dxa"/>
+            <w:tcW w:w="1975" w:type="dxa"/>
             <w:tcBorders>
               <w:top w:val="nil"/>
               <w:left w:val="nil"/>
@@ -2700,7 +2455,7 @@
         </w:tc>
         <w:tc>
           <w:tcPr>
-            <w:tcW w:w="7649" w:type="dxa"/>
+            <w:tcW w:w="7650" w:type="dxa"/>
             <w:tcBorders>
               <w:top w:val="nil"/>
               <w:left w:val="nil"/>
@@ -2731,10 +2486,10 @@
                 <w:rFonts w:eastAsia="Times New Roman" w:cs="Times New Roman" w:ascii="Calibri" w:hAnsi="Calibri"/>
                 <w:kern w:val="0"/>
                 <w:sz w:val="22"/>
-                <w:szCs w:val="20"/>
-                <w:lang w:val="en-US" w:eastAsia="en-US" w:bidi="ar-SA"/>
-              </w:rPr>
-              <w:t xml:space="preserve">Multi-Biometric Identification Software (MBIS) Proprietary software developed by Idemia for identification and classification of soft and hard bio-markers. </w:t>
+                <w:szCs w:val="22"/>
+                <w:lang w:val="en-US" w:eastAsia="en-US" w:bidi="ar-SA"/>
+              </w:rPr>
+              <w:t>Idemia Driver 360</w:t>
             </w:r>
           </w:p>
         </w:tc>
@@ -2780,7 +2535,7 @@
         </w:tc>
         <w:tc>
           <w:tcPr>
-            <w:tcW w:w="1976" w:type="dxa"/>
+            <w:tcW w:w="1975" w:type="dxa"/>
             <w:tcBorders>
               <w:top w:val="nil"/>
               <w:left w:val="nil"/>
@@ -2822,7 +2577,7 @@
         </w:tc>
         <w:tc>
           <w:tcPr>
-            <w:tcW w:w="7649" w:type="dxa"/>
+            <w:tcW w:w="7650" w:type="dxa"/>
             <w:tcBorders>
               <w:top w:val="nil"/>
               <w:left w:val="nil"/>
@@ -2856,23 +2611,9 @@
                 <w:szCs w:val="22"/>
                 <w:lang w:val="en-US" w:eastAsia="en-US" w:bidi="ar-SA"/>
               </w:rPr>
-              <w:t xml:space="preserve">Lead DevOps Engineer (lead a team of 3 engineers deploying across many states) </w:t>
-            </w:r>
-          </w:p>
-        </w:tc>
-      </w:tr>
-      <w:tr>
-        <w:trPr/>
-        <w:tc>
-          <w:tcPr>
-            <w:tcW w:w="445" w:type="dxa"/>
-            <w:tcBorders>
-              <w:top w:val="nil"/>
-              <w:left w:val="nil"/>
-              <w:bottom w:val="nil"/>
-              <w:right w:val="nil"/>
-            </w:tcBorders>
-          </w:tcPr>
+              <w:t xml:space="preserve">Lead DevOps Engineer, Systems Administrator, Lead Tier 3 Support </w:t>
+            </w:r>
+          </w:p>
           <w:p>
             <w:pPr>
               <w:pStyle w:val="Normal"/>
@@ -2893,16 +2634,59 @@
             </w:pPr>
             <w:r>
               <w:rPr>
-                <w:rFonts w:ascii="Calibri" w:hAnsi="Calibri"/>
-                <w:sz w:val="22"/>
-                <w:szCs w:val="22"/>
-              </w:rPr>
-            </w:r>
-          </w:p>
-        </w:tc>
-        <w:tc>
-          <w:tcPr>
-            <w:tcW w:w="1976" w:type="dxa"/>
+                <w:rFonts w:eastAsia="Times New Roman" w:cs="Times New Roman" w:ascii="Calibri" w:hAnsi="Calibri"/>
+                <w:kern w:val="0"/>
+                <w:sz w:val="22"/>
+                <w:szCs w:val="22"/>
+                <w:lang w:val="en-US" w:eastAsia="en-US" w:bidi="ar-SA"/>
+              </w:rPr>
+              <w:t xml:space="preserve">(lead a team of 4 engineers to deploy out to Oklahoma environments) </w:t>
+            </w:r>
+          </w:p>
+        </w:tc>
+      </w:tr>
+      <w:tr>
+        <w:trPr/>
+        <w:tc>
+          <w:tcPr>
+            <w:tcW w:w="445" w:type="dxa"/>
+            <w:tcBorders>
+              <w:top w:val="nil"/>
+              <w:left w:val="nil"/>
+              <w:bottom w:val="nil"/>
+              <w:right w:val="nil"/>
+            </w:tcBorders>
+          </w:tcPr>
+          <w:p>
+            <w:pPr>
+              <w:pStyle w:val="Normal"/>
+              <w:widowControl w:val="false"/>
+              <w:tabs>
+                <w:tab w:val="clear" w:pos="720"/>
+                <w:tab w:val="right" w:pos="2646" w:leader="none"/>
+                <w:tab w:val="right" w:pos="9180" w:leader="none"/>
+              </w:tabs>
+              <w:suppressAutoHyphens w:val="true"/>
+              <w:spacing w:lineRule="atLeast" w:line="260" w:before="0" w:after="120"/>
+              <w:jc w:val="left"/>
+              <w:rPr>
+                <w:rFonts w:ascii="Calibri" w:hAnsi="Calibri"/>
+                <w:sz w:val="22"/>
+                <w:szCs w:val="22"/>
+              </w:rPr>
+            </w:pPr>
+            <w:r>
+              <w:rPr>
+                <w:rFonts w:ascii="Calibri" w:hAnsi="Calibri"/>
+                <w:sz w:val="22"/>
+                <w:szCs w:val="22"/>
+              </w:rPr>
+            </w:r>
+          </w:p>
+        </w:tc>
+        <w:tc>
+          <w:tcPr>
+            <w:tcW w:w="1975" w:type="dxa"/>
             <w:tcBorders>
               <w:top w:val="nil"/>
               <w:left w:val="nil"/>
@@ -2944,7 +2728,7 @@
         </w:tc>
         <w:tc>
           <w:tcPr>
-            <w:tcW w:w="7649" w:type="dxa"/>
+            <w:tcW w:w="7650" w:type="dxa"/>
             <w:tcBorders>
               <w:top w:val="nil"/>
               <w:left w:val="nil"/>
@@ -2978,7 +2762,7 @@
                 <w:szCs w:val="22"/>
                 <w:lang w:val="en-US" w:eastAsia="en-US" w:bidi="ar-SA"/>
               </w:rPr>
-              <w:t>5 Months</w:t>
+              <w:t>2 years 6 Months</w:t>
             </w:r>
           </w:p>
         </w:tc>
@@ -3024,7 +2808,7 @@
         </w:tc>
         <w:tc>
           <w:tcPr>
-            <w:tcW w:w="1976" w:type="dxa"/>
+            <w:tcW w:w="1975" w:type="dxa"/>
             <w:tcBorders>
               <w:top w:val="nil"/>
               <w:left w:val="nil"/>
@@ -3071,7 +2855,7 @@
         </w:tc>
         <w:tc>
           <w:tcPr>
-            <w:tcW w:w="7649" w:type="dxa"/>
+            <w:tcW w:w="7650" w:type="dxa"/>
             <w:tcBorders>
               <w:top w:val="nil"/>
               <w:left w:val="nil"/>
@@ -3103,7 +2887,7 @@
                 <w:szCs w:val="20"/>
                 <w:lang w:val="en-US" w:eastAsia="en-US" w:bidi="ar-SA"/>
               </w:rPr>
-              <w:t xml:space="preserve">Deployment of Ansible Scripts to install custom RPM packages to deployed RHEL servers. </w:t>
+              <w:t>Develop Pipeline and entire CI/CD process for promotion of Back-Office code to Production Systems</w:t>
             </w:r>
           </w:p>
           <w:p>
@@ -3130,7 +2914,88 @@
                 <w:szCs w:val="20"/>
                 <w:lang w:val="en-US" w:eastAsia="en-US" w:bidi="ar-SA"/>
               </w:rPr>
-              <w:t xml:space="preserve">Create and edit Ansible scripts to continue development of the pipeline.  </w:t>
+              <w:t>Manage MoveIT, Pentaho, and External Interface connectivity to subsidiary systems</w:t>
+            </w:r>
+          </w:p>
+          <w:p>
+            <w:pPr>
+              <w:pStyle w:val="Normal"/>
+              <w:widowControl w:val="false"/>
+              <w:numPr>
+                <w:ilvl w:val="0"/>
+                <w:numId w:val="2"/>
+              </w:numPr>
+              <w:suppressAutoHyphens w:val="true"/>
+              <w:spacing w:before="60" w:after="0"/>
+              <w:jc w:val="left"/>
+              <w:rPr>
+                <w:rFonts w:ascii="Calibri" w:hAnsi="Calibri" w:cs="Calibri"/>
+                <w:sz w:val="22"/>
+              </w:rPr>
+            </w:pPr>
+            <w:r>
+              <w:rPr>
+                <w:rFonts w:eastAsia="Times New Roman" w:cs="Calibri" w:ascii="Calibri" w:hAnsi="Calibri"/>
+                <w:kern w:val="0"/>
+                <w:sz w:val="22"/>
+                <w:szCs w:val="20"/>
+                <w:lang w:val="en-US" w:eastAsia="en-US" w:bidi="ar-SA"/>
+              </w:rPr>
+              <w:t>Deployment of all code and validation of deployment process</w:t>
+            </w:r>
+          </w:p>
+          <w:p>
+            <w:pPr>
+              <w:pStyle w:val="Normal"/>
+              <w:widowControl w:val="false"/>
+              <w:numPr>
+                <w:ilvl w:val="0"/>
+                <w:numId w:val="2"/>
+              </w:numPr>
+              <w:suppressAutoHyphens w:val="true"/>
+              <w:spacing w:before="60" w:after="0"/>
+              <w:jc w:val="left"/>
+              <w:rPr>
+                <w:rFonts w:ascii="Calibri" w:hAnsi="Calibri" w:cs="Calibri"/>
+                <w:sz w:val="22"/>
+              </w:rPr>
+            </w:pPr>
+            <w:r>
+              <w:rPr>
+                <w:rFonts w:eastAsia="Times New Roman" w:cs="Calibri" w:ascii="Calibri" w:hAnsi="Calibri"/>
+                <w:kern w:val="0"/>
+                <w:sz w:val="22"/>
+                <w:szCs w:val="20"/>
+                <w:lang w:val="en-US" w:eastAsia="en-US" w:bidi="ar-SA"/>
+              </w:rPr>
+              <w:t>Lead deployment of new environments and maintain the infrastructure of existing environments.</w:t>
+            </w:r>
+          </w:p>
+          <w:p>
+            <w:pPr>
+              <w:pStyle w:val="Normal"/>
+              <w:widowControl w:val="false"/>
+              <w:numPr>
+                <w:ilvl w:val="0"/>
+                <w:numId w:val="2"/>
+              </w:numPr>
+              <w:suppressAutoHyphens w:val="true"/>
+              <w:spacing w:before="60" w:after="0"/>
+              <w:jc w:val="left"/>
+              <w:rPr>
+                <w:rFonts w:ascii="Calibri" w:hAnsi="Calibri" w:cs="Calibri"/>
+                <w:sz w:val="22"/>
+              </w:rPr>
+            </w:pPr>
+            <w:r>
+              <w:rPr>
+                <w:rFonts w:eastAsia="Times New Roman" w:cs="Calibri" w:ascii="Calibri" w:hAnsi="Calibri"/>
+                <w:kern w:val="0"/>
+                <w:sz w:val="22"/>
+                <w:szCs w:val="20"/>
+                <w:lang w:val="en-US" w:eastAsia="en-US" w:bidi="ar-SA"/>
+              </w:rPr>
+              <w:t xml:space="preserve">Lead for security and auditing of the systems in production. Control over all user accounts and maintenance and updates to systems. </w:t>
             </w:r>
           </w:p>
         </w:tc>
@@ -3176,7 +3041,7 @@
         </w:tc>
         <w:tc>
           <w:tcPr>
-            <w:tcW w:w="1976" w:type="dxa"/>
+            <w:tcW w:w="1975" w:type="dxa"/>
             <w:tcBorders>
               <w:top w:val="nil"/>
               <w:left w:val="nil"/>
@@ -3218,7 +3083,7 @@
         </w:tc>
         <w:tc>
           <w:tcPr>
-            <w:tcW w:w="7649" w:type="dxa"/>
+            <w:tcW w:w="7650" w:type="dxa"/>
             <w:tcBorders>
               <w:top w:val="nil"/>
               <w:left w:val="nil"/>
@@ -3252,7 +3117,7 @@
                 <w:szCs w:val="22"/>
                 <w:lang w:val="en-US" w:eastAsia="en-US" w:bidi="ar-SA"/>
               </w:rPr>
-              <w:t xml:space="preserve">RHEL, Centos 8 - Kernel 4.18 </w:t>
+              <w:t>Windows Server 2016 (Release 1607 10.0.14393.5066)</w:t>
             </w:r>
           </w:p>
         </w:tc>
@@ -3298,7 +3163,7 @@
         </w:tc>
         <w:tc>
           <w:tcPr>
-            <w:tcW w:w="1976" w:type="dxa"/>
+            <w:tcW w:w="1975" w:type="dxa"/>
             <w:tcBorders>
               <w:top w:val="nil"/>
               <w:left w:val="nil"/>
@@ -3341,7 +3206,7 @@
         </w:tc>
         <w:tc>
           <w:tcPr>
-            <w:tcW w:w="7649" w:type="dxa"/>
+            <w:tcW w:w="7650" w:type="dxa"/>
             <w:tcBorders>
               <w:top w:val="nil"/>
               <w:left w:val="nil"/>
@@ -3375,13 +3240,15 @@
                 <w:szCs w:val="22"/>
                 <w:lang w:val="en-US" w:eastAsia="en-US" w:bidi="ar-SA"/>
               </w:rPr>
-              <w:t>Ansible, BASH Scripting</w:t>
+              <w:t xml:space="preserve">.NET 4.6.2, PowerShell, JavaScript, Microsoft SQL </w:t>
             </w:r>
           </w:p>
         </w:tc>
       </w:tr>
       <w:tr>
-        <w:trPr/>
+        <w:trPr>
+          <w:trHeight w:val="1129" w:hRule="atLeast"/>
+        </w:trPr>
         <w:tc>
           <w:tcPr>
             <w:tcW w:w="445" w:type="dxa"/>
@@ -3421,7 +3288,7 @@
         </w:tc>
         <w:tc>
           <w:tcPr>
-            <w:tcW w:w="1976" w:type="dxa"/>
+            <w:tcW w:w="1975" w:type="dxa"/>
             <w:tcBorders>
               <w:top w:val="nil"/>
               <w:left w:val="nil"/>
@@ -3464,7 +3331,7 @@
         </w:tc>
         <w:tc>
           <w:tcPr>
-            <w:tcW w:w="7649" w:type="dxa"/>
+            <w:tcW w:w="7650" w:type="dxa"/>
             <w:tcBorders>
               <w:top w:val="nil"/>
               <w:left w:val="nil"/>
@@ -3490,6 +3357,19 @@
                 <w:szCs w:val="22"/>
               </w:rPr>
             </w:pPr>
+            <w:hyperlink r:id="rId13">
+              <w:r>
+                <w:rPr>
+                  <w:rStyle w:val="InternetLink"/>
+                  <w:rFonts w:eastAsia="Times New Roman" w:cs="Times New Roman" w:ascii="Calibri" w:hAnsi="Calibri"/>
+                  <w:kern w:val="0"/>
+                  <w:sz w:val="22"/>
+                  <w:szCs w:val="22"/>
+                  <w:lang w:val="en-US" w:eastAsia="en-US" w:bidi="ar-SA"/>
+                </w:rPr>
+                <w:t>Octopus</w:t>
+              </w:r>
+            </w:hyperlink>
             <w:r>
               <w:rPr>
                 <w:rFonts w:eastAsia="Times New Roman" w:cs="Times New Roman" w:ascii="Calibri" w:hAnsi="Calibri"/>
@@ -3498,7 +3378,151 @@
                 <w:szCs w:val="22"/>
                 <w:lang w:val="en-US" w:eastAsia="en-US" w:bidi="ar-SA"/>
               </w:rPr>
-              <w:t xml:space="preserve">Ansible, Azure DevOps </w:t>
+              <w:t xml:space="preserve">, Jenkins, </w:t>
+            </w:r>
+            <w:hyperlink r:id="rId14">
+              <w:r>
+                <w:rPr>
+                  <w:rStyle w:val="InternetLink"/>
+                  <w:rFonts w:eastAsia="Times New Roman" w:cs="Times New Roman" w:ascii="Calibri" w:hAnsi="Calibri"/>
+                  <w:kern w:val="0"/>
+                  <w:sz w:val="22"/>
+                  <w:szCs w:val="22"/>
+                  <w:lang w:val="en-US" w:eastAsia="en-US" w:bidi="ar-SA"/>
+                </w:rPr>
+                <w:t>MoveIT</w:t>
+              </w:r>
+            </w:hyperlink>
+            <w:r>
+              <w:rPr>
+                <w:rFonts w:eastAsia="Times New Roman" w:cs="Times New Roman" w:ascii="Calibri" w:hAnsi="Calibri"/>
+                <w:kern w:val="0"/>
+                <w:sz w:val="22"/>
+                <w:szCs w:val="22"/>
+                <w:lang w:val="en-US" w:eastAsia="en-US" w:bidi="ar-SA"/>
+              </w:rPr>
+              <w:t xml:space="preserve">, </w:t>
+            </w:r>
+            <w:hyperlink r:id="rId15">
+              <w:r>
+                <w:rPr>
+                  <w:rStyle w:val="InternetLink"/>
+                  <w:rFonts w:eastAsia="Times New Roman" w:cs="Times New Roman" w:ascii="Calibri" w:hAnsi="Calibri"/>
+                  <w:kern w:val="0"/>
+                  <w:sz w:val="22"/>
+                  <w:szCs w:val="22"/>
+                  <w:lang w:val="en-US" w:eastAsia="en-US" w:bidi="ar-SA"/>
+                </w:rPr>
+                <w:t>Pentaho</w:t>
+              </w:r>
+            </w:hyperlink>
+            <w:r>
+              <w:rPr>
+                <w:rFonts w:eastAsia="Times New Roman" w:cs="Times New Roman" w:ascii="Calibri" w:hAnsi="Calibri"/>
+                <w:kern w:val="0"/>
+                <w:sz w:val="22"/>
+                <w:szCs w:val="22"/>
+                <w:lang w:val="en-US" w:eastAsia="en-US" w:bidi="ar-SA"/>
+              </w:rPr>
+              <w:t xml:space="preserve">, </w:t>
+            </w:r>
+            <w:hyperlink r:id="rId16">
+              <w:r>
+                <w:rPr>
+                  <w:rStyle w:val="InternetLink"/>
+                  <w:rFonts w:eastAsia="Times New Roman" w:cs="Times New Roman" w:ascii="Calibri" w:hAnsi="Calibri"/>
+                  <w:kern w:val="0"/>
+                  <w:sz w:val="22"/>
+                  <w:szCs w:val="22"/>
+                  <w:lang w:val="en-US" w:eastAsia="en-US" w:bidi="ar-SA"/>
+                </w:rPr>
+                <w:t>MSCRM</w:t>
+              </w:r>
+            </w:hyperlink>
+            <w:r>
+              <w:rPr>
+                <w:rFonts w:eastAsia="Times New Roman" w:cs="Times New Roman" w:ascii="Calibri" w:hAnsi="Calibri"/>
+                <w:kern w:val="0"/>
+                <w:sz w:val="22"/>
+                <w:szCs w:val="22"/>
+                <w:lang w:val="en-US" w:eastAsia="en-US" w:bidi="ar-SA"/>
+              </w:rPr>
+              <w:t xml:space="preserve">, ZScaler, </w:t>
+            </w:r>
+            <w:hyperlink r:id="rId17">
+              <w:r>
+                <w:rPr>
+                  <w:rStyle w:val="InternetLink"/>
+                  <w:rFonts w:eastAsia="Times New Roman" w:cs="Times New Roman" w:ascii="Calibri" w:hAnsi="Calibri"/>
+                  <w:kern w:val="0"/>
+                  <w:sz w:val="22"/>
+                  <w:szCs w:val="22"/>
+                  <w:lang w:val="en-US" w:eastAsia="en-US" w:bidi="ar-SA"/>
+                </w:rPr>
+                <w:t>F5</w:t>
+              </w:r>
+            </w:hyperlink>
+            <w:r>
+              <w:rPr>
+                <w:rFonts w:eastAsia="Times New Roman" w:cs="Times New Roman" w:ascii="Calibri" w:hAnsi="Calibri"/>
+                <w:kern w:val="0"/>
+                <w:sz w:val="22"/>
+                <w:szCs w:val="22"/>
+                <w:lang w:val="en-US" w:eastAsia="en-US" w:bidi="ar-SA"/>
+              </w:rPr>
+              <w:t xml:space="preserve">, IIS. </w:t>
+            </w:r>
+          </w:p>
+          <w:p>
+            <w:pPr>
+              <w:pStyle w:val="Normal"/>
+              <w:widowControl w:val="false"/>
+              <w:tabs>
+                <w:tab w:val="clear" w:pos="720"/>
+                <w:tab w:val="right" w:pos="2646" w:leader="none"/>
+                <w:tab w:val="right" w:pos="9180" w:leader="none"/>
+              </w:tabs>
+              <w:suppressAutoHyphens w:val="true"/>
+              <w:spacing w:lineRule="atLeast" w:line="260" w:before="0" w:after="120"/>
+              <w:jc w:val="left"/>
+              <w:rPr>
+                <w:rFonts w:ascii="Calibri" w:hAnsi="Calibri"/>
+                <w:sz w:val="22"/>
+                <w:szCs w:val="22"/>
+              </w:rPr>
+            </w:pPr>
+            <w:r>
+              <w:rPr>
+                <w:rFonts w:eastAsia="Times New Roman" w:cs="Times New Roman" w:ascii="Calibri" w:hAnsi="Calibri"/>
+                <w:kern w:val="0"/>
+                <w:sz w:val="22"/>
+                <w:szCs w:val="22"/>
+                <w:lang w:val="en-US" w:eastAsia="en-US" w:bidi="ar-SA"/>
+              </w:rPr>
+              <w:t xml:space="preserve">Domain Tools: SCCM, SCOM, LDAP, </w:t>
+            </w:r>
+            <w:hyperlink r:id="rId18">
+              <w:r>
+                <w:rPr>
+                  <w:rStyle w:val="InternetLink"/>
+                  <w:rFonts w:eastAsia="Times New Roman" w:cs="Times New Roman" w:ascii="Calibri" w:hAnsi="Calibri"/>
+                  <w:kern w:val="0"/>
+                  <w:sz w:val="22"/>
+                  <w:szCs w:val="22"/>
+                  <w:lang w:val="en-US" w:eastAsia="en-US" w:bidi="ar-SA"/>
+                </w:rPr>
+                <w:t>Dynatrace</w:t>
+              </w:r>
+            </w:hyperlink>
+            <w:r>
+              <w:rPr>
+                <w:rFonts w:eastAsia="Times New Roman" w:cs="Times New Roman" w:ascii="Calibri" w:hAnsi="Calibri"/>
+                <w:kern w:val="0"/>
+                <w:sz w:val="22"/>
+                <w:szCs w:val="22"/>
+                <w:lang w:val="en-US" w:eastAsia="en-US" w:bidi="ar-SA"/>
+              </w:rPr>
+              <w:t>, Microsoft DNS, DFS FileShare, MS Certificate Store.</w:t>
             </w:r>
           </w:p>
         </w:tc>
@@ -3520,76 +3544,8 @@
           <w:szCs w:val="22"/>
         </w:rPr>
       </w:r>
-    </w:p>
-    <w:p>
-      <w:pPr>
-        <w:pStyle w:val="Normal"/>
-        <w:rPr>
-          <w:rFonts w:ascii="Calibri" w:hAnsi="Calibri"/>
-          <w:sz w:val="22"/>
-          <w:szCs w:val="22"/>
-        </w:rPr>
-      </w:pPr>
-      <w:r>
-        <w:rPr>
-          <w:rFonts w:ascii="Calibri" w:hAnsi="Calibri"/>
-          <w:sz w:val="22"/>
-          <w:szCs w:val="22"/>
-        </w:rPr>
-      </w:r>
-    </w:p>
-    <w:p>
-      <w:pPr>
-        <w:pStyle w:val="Normal"/>
-        <w:rPr>
-          <w:rFonts w:ascii="Calibri" w:hAnsi="Calibri"/>
-          <w:sz w:val="22"/>
-          <w:szCs w:val="22"/>
-        </w:rPr>
-      </w:pPr>
-      <w:r>
-        <w:rPr>
-          <w:rFonts w:ascii="Calibri" w:hAnsi="Calibri"/>
-          <w:sz w:val="22"/>
-          <w:szCs w:val="22"/>
-        </w:rPr>
-      </w:r>
-    </w:p>
-    <w:p>
-      <w:pPr>
-        <w:pStyle w:val="Normal"/>
-        <w:rPr>
-          <w:rFonts w:ascii="Calibri" w:hAnsi="Calibri"/>
-          <w:sz w:val="22"/>
-          <w:szCs w:val="22"/>
-        </w:rPr>
-      </w:pPr>
-      <w:r>
-        <w:rPr>
-          <w:rFonts w:ascii="Calibri" w:hAnsi="Calibri"/>
-          <w:sz w:val="22"/>
-          <w:szCs w:val="22"/>
-        </w:rPr>
-      </w:r>
       <w:r>
         <w:br w:type="page"/>
-      </w:r>
-    </w:p>
-    <w:p>
-      <w:pPr>
-        <w:pStyle w:val="Normal"/>
-        <w:rPr>
-          <w:rFonts w:ascii="Calibri" w:hAnsi="Calibri"/>
-          <w:sz w:val="22"/>
-          <w:szCs w:val="22"/>
-        </w:rPr>
-      </w:pPr>
-      <w:r>
-        <w:rPr>
-          <w:rFonts w:ascii="Calibri" w:hAnsi="Calibri"/>
-          <w:sz w:val="22"/>
-          <w:szCs w:val="22"/>
-        </w:rPr>
       </w:r>
     </w:p>
     <w:p>
@@ -3625,8 +3581,8 @@
       </w:tblPr>
       <w:tblGrid>
         <w:gridCol w:w="445"/>
-        <w:gridCol w:w="1976"/>
-        <w:gridCol w:w="7649"/>
+        <w:gridCol w:w="1975"/>
+        <w:gridCol w:w="7650"/>
       </w:tblGrid>
       <w:tr>
         <w:trPr/>
@@ -3670,7 +3626,7 @@
         </w:tc>
         <w:tc>
           <w:tcPr>
-            <w:tcW w:w="1976" w:type="dxa"/>
+            <w:tcW w:w="1975" w:type="dxa"/>
             <w:tcBorders>
               <w:top w:val="nil"/>
               <w:left w:val="nil"/>
@@ -3712,7 +3668,7 @@
         </w:tc>
         <w:tc>
           <w:tcPr>
-            <w:tcW w:w="7649" w:type="dxa"/>
+            <w:tcW w:w="7650" w:type="dxa"/>
             <w:tcBorders>
               <w:top w:val="nil"/>
               <w:left w:val="nil"/>
@@ -3794,7 +3750,7 @@
         </w:tc>
         <w:tc>
           <w:tcPr>
-            <w:tcW w:w="1976" w:type="dxa"/>
+            <w:tcW w:w="1975" w:type="dxa"/>
             <w:tcBorders>
               <w:top w:val="nil"/>
               <w:left w:val="nil"/>
@@ -3836,7 +3792,7 @@
         </w:tc>
         <w:tc>
           <w:tcPr>
-            <w:tcW w:w="7649" w:type="dxa"/>
+            <w:tcW w:w="7650" w:type="dxa"/>
             <w:tcBorders>
               <w:top w:val="nil"/>
               <w:left w:val="nil"/>
@@ -3918,7 +3874,7 @@
         </w:tc>
         <w:tc>
           <w:tcPr>
-            <w:tcW w:w="1976" w:type="dxa"/>
+            <w:tcW w:w="1975" w:type="dxa"/>
             <w:tcBorders>
               <w:top w:val="nil"/>
               <w:left w:val="nil"/>
@@ -3960,7 +3916,7 @@
         </w:tc>
         <w:tc>
           <w:tcPr>
-            <w:tcW w:w="7649" w:type="dxa"/>
+            <w:tcW w:w="7650" w:type="dxa"/>
             <w:tcBorders>
               <w:top w:val="nil"/>
               <w:left w:val="nil"/>
@@ -4042,7 +3998,7 @@
         </w:tc>
         <w:tc>
           <w:tcPr>
-            <w:tcW w:w="1976" w:type="dxa"/>
+            <w:tcW w:w="1975" w:type="dxa"/>
             <w:tcBorders>
               <w:top w:val="nil"/>
               <w:left w:val="nil"/>
@@ -4090,7 +4046,7 @@
         </w:tc>
         <w:tc>
           <w:tcPr>
-            <w:tcW w:w="7649" w:type="dxa"/>
+            <w:tcW w:w="7650" w:type="dxa"/>
             <w:tcBorders>
               <w:top w:val="nil"/>
               <w:left w:val="nil"/>
@@ -4390,7 +4346,7 @@
         </w:tc>
         <w:tc>
           <w:tcPr>
-            <w:tcW w:w="1976" w:type="dxa"/>
+            <w:tcW w:w="1975" w:type="dxa"/>
             <w:tcBorders>
               <w:top w:val="nil"/>
               <w:left w:val="nil"/>
@@ -4432,7 +4388,7 @@
         </w:tc>
         <w:tc>
           <w:tcPr>
-            <w:tcW w:w="7649" w:type="dxa"/>
+            <w:tcW w:w="7650" w:type="dxa"/>
             <w:tcBorders>
               <w:top w:val="nil"/>
               <w:left w:val="nil"/>
@@ -4514,7 +4470,7 @@
         </w:tc>
         <w:tc>
           <w:tcPr>
-            <w:tcW w:w="1976" w:type="dxa"/>
+            <w:tcW w:w="1975" w:type="dxa"/>
             <w:tcBorders>
               <w:top w:val="nil"/>
               <w:left w:val="nil"/>
@@ -4558,7 +4514,7 @@
         </w:tc>
         <w:tc>
           <w:tcPr>
-            <w:tcW w:w="7649" w:type="dxa"/>
+            <w:tcW w:w="7650" w:type="dxa"/>
             <w:tcBorders>
               <w:top w:val="nil"/>
               <w:left w:val="nil"/>
@@ -4640,7 +4596,7 @@
         </w:tc>
         <w:tc>
           <w:tcPr>
-            <w:tcW w:w="1976" w:type="dxa"/>
+            <w:tcW w:w="1975" w:type="dxa"/>
             <w:tcBorders>
               <w:top w:val="nil"/>
               <w:left w:val="nil"/>
@@ -4684,7 +4640,7 @@
         </w:tc>
         <w:tc>
           <w:tcPr>
-            <w:tcW w:w="7649" w:type="dxa"/>
+            <w:tcW w:w="7650" w:type="dxa"/>
             <w:tcBorders>
               <w:top w:val="nil"/>
               <w:left w:val="nil"/>
@@ -4904,7 +4860,7 @@
         <w:szCs w:val="18"/>
         <w:rFonts w:cs="Arial" w:ascii="Calibri" w:hAnsi="Calibri"/>
       </w:rPr>
-      <w:t>3</w:t>
+      <w:t>2</w:t>
     </w:r>
     <w:r>
       <w:rPr>

</xml_diff>